<commit_message>
docs: enrich HabitatIA deliverable metrics
</commit_message>
<xml_diff>
--- a/Entregable N1 HabitatIA.docx
+++ b/Entregable N1 HabitatIA.docx
@@ -1460,6 +1460,12 @@
       </w:r>
     </w:p>
     <w:p>
+      <w:pPr/>
+      <w:r>
+        <w:t>La escala regional del problema confirma que no se trata de una dificultad marginal. El Banco Interamericano de Desarrollo sostuvo recientemente que alrededor del 45 % de los hogares de América Latina y el Caribe no accede a una vivienda adecuada, en una región donde cerca del 82 % de la población ya vive en ciudades. Esta doble condición resulta especialmente relevante para HabitatIA: la presión habitacional crece en contextos urbanos densos, mientras la necesidad de tomar decisiones más informadas, más rápidas y más eficientes se vuelve cada vez más visible.</w:t>
+      </w:r>
+    </w:p>
+    <w:p>
       <w:pPr>
         <w:spacing w:after="200" w:before="0" w:line="240" w:lineRule="auto"/>
         <w:rPr/>
@@ -1561,6 +1567,12 @@
       </w:r>
     </w:p>
     <w:p>
+      <w:pPr/>
+      <w:r>
+        <w:t>Si se baja esta lectura al caso argentino, la magnitud también es contundente. La Cámara Argentina de la Construcción estimó para 2022 un déficit habitacional total cercano a 3,24 millones de viviendas. A su vez, Fundación Tejido Urbano, sobre base Censo 2022, sostuvo que alrededor de 10,7 millones de hogares urbanos, equivalentes al 73 % del total relevado, presentan al menos algún problema habitacional. Aunque ambas mediciones responden a metodologías distintas, coinciden en algo central: el universo de hogares que necesita mejorar, ampliar, reorganizar o resolver su situación habitacional es demasiado amplio como para pensar el problema como un nicho.</w:t>
+      </w:r>
+    </w:p>
+    <w:p>
       <w:pPr>
         <w:spacing w:after="200" w:before="0" w:line="240" w:lineRule="auto"/>
         <w:rPr/>
@@ -1820,23 +1832,7 @@
         <w:rPr/>
       </w:pPr>
       <w:r>
-        <w:rPr>
-          <w:rFonts w:ascii="Calibri" w:cs="Calibri" w:eastAsia="Calibri" w:hAnsi="Calibri"/>
-          <w:b w:val="0"/>
-          <w:bCs w:val="0"/>
-          <w:i w:val="0"/>
-          <w:iCs w:val="0"/>
-          <w:color w:val="1a1a2e"/>
-          <w:sz w:val="26"/>
-          <w:szCs w:val="26"/>
-          <w:rtl w:val="0"/>
-        </w:rPr>
-        <w:t xml:space="preserve">La necesidad de soluciones habitacionales económicamente previsibles sigue creciendo en hogares que necesitan construir, ampliar o reorganizar su vivienda con mayor claridad. Al mismo tiempo, cambia la expectativa del usuario frente a decisiones complejas: cada vez hay más demanda de herramientas que ayuden a ordenar información, reducir incertidumbre y dar un primer paso con mayor autonomía.</w:t>
-      </w:r>
-      <w:r>
-        <w:rPr>
-          <w:rtl w:val="0"/>
-        </w:rPr>
+        <w:t>La necesidad de soluciones habitacionales económicamente previsibles sigue creciendo en hogares que necesitan construir, ampliar o reorganizar su vivienda con mayor claridad. Al mismo tiempo, cambia la expectativa del usuario frente a decisiones complejas: cada vez hay más demanda de herramientas que ayuden a ordenar información, reducir incertidumbre y dar un primer paso con mayor autonomía. Esta tendencia no se apoya solo en una percepción cualitativa. Si en América Latina y el Caribe cerca del 45 % de los hogares no accede todavía a una vivienda adecuada, entonces la necesidad de herramientas que mejoren la etapa inicial de decisión no pertenece a un segmento menor, sino a una masa crítica muy amplia.</w:t>
       </w:r>
     </w:p>
     <w:p>
@@ -1922,23 +1918,7 @@
         <w:rPr/>
       </w:pPr>
       <w:r>
-        <w:rPr>
-          <w:rFonts w:ascii="Calibri" w:cs="Calibri" w:eastAsia="Calibri" w:hAnsi="Calibri"/>
-          <w:b w:val="0"/>
-          <w:bCs w:val="0"/>
-          <w:i w:val="0"/>
-          <w:iCs w:val="0"/>
-          <w:color w:val="1a1a2e"/>
-          <w:sz w:val="26"/>
-          <w:szCs w:val="26"/>
-          <w:rtl w:val="0"/>
-        </w:rPr>
-        <w:t xml:space="preserve">El sector muestra una mayor sensibilidad frente al desperdicio, la sostenibilidad y la necesidad de experiencias de compra y decisión menos opacas. En ese marco, la reutilización de materiales y la organización de canales más eficientes para conectar oferta y demanda ganan relevancia económica y operativa.</w:t>
-      </w:r>
-      <w:r>
-        <w:rPr>
-          <w:rtl w:val="0"/>
-        </w:rPr>
+        <w:t>El sector muestra una mayor sensibilidad frente al desperdicio, la sostenibilidad y la necesidad de experiencias de compra y decisión menos opacas. En ese marco, la reutilización de materiales y la organización de canales más eficientes para conectar oferta y demanda ganan relevancia económica y operativa. La escala económica del problema también ayuda a leer esta oportunidad con mayor precisión. El propio BID subrayó que la producción habitacional y la construcción movilizan una industria que en economías desarrolladas representa entre 5 % y 10 % del PIB. A eso se suma otra evidencia relevante para HabitatIA: la literatura y los relevamientos sectoriales ubican, de forma conservadora, el desperdicio de materiales de obra en una banda aproximada del 10 % al 15 %. Cuando ese desperdicio se combina con un mercado amplio, fragmentado y todavía poco transparente, ordenar información y recircular materiales deja de ser solo una mejora operativa y pasa a ser una oportunidad económica clara.</w:t>
       </w:r>
     </w:p>
     <w:p>
@@ -2023,115 +2003,25 @@
         <w:rPr/>
       </w:pPr>
       <w:r>
-        <w:rPr>
-          <w:rFonts w:ascii="Calibri" w:cs="Calibri" w:eastAsia="Calibri" w:hAnsi="Calibri"/>
-          <w:b w:val="1"/>
-          <w:bCs w:val="1"/>
-          <w:i w:val="0"/>
-          <w:iCs w:val="0"/>
-          <w:color w:val="1a1a2e"/>
-          <w:sz w:val="26"/>
-          <w:szCs w:val="26"/>
-          <w:rtl w:val="0"/>
-        </w:rPr>
-        <w:t xml:space="preserve">ODS 11, Ciudades y comunidades sostenibles.</w:t>
-      </w:r>
-      <w:r>
-        <w:rPr>
-          <w:rFonts w:ascii="Calibri" w:cs="Calibri" w:eastAsia="Calibri" w:hAnsi="Calibri"/>
-          <w:b w:val="0"/>
-          <w:bCs w:val="0"/>
-          <w:i w:val="0"/>
-          <w:iCs w:val="0"/>
-          <w:color w:val="1a1a2e"/>
-          <w:sz w:val="26"/>
-          <w:szCs w:val="26"/>
-          <w:rtl w:val="0"/>
-        </w:rPr>
-        <w:t xml:space="preserve"> La plataforma mejora el acceso a una planificación habitacional más eficiente y ordenada, con herramientas que ayudan a tomar decisiones iniciales con mayor claridad.</w:t>
-      </w:r>
-      <w:r>
-        <w:rPr>
-          <w:rtl w:val="0"/>
-        </w:rPr>
-      </w:r>
-    </w:p>
-    <w:p>
-      <w:pPr>
-        <w:spacing w:after="200" w:before="0" w:line="240" w:lineRule="auto"/>
-        <w:rPr/>
-      </w:pPr>
-      <w:r>
-        <w:rPr>
-          <w:rFonts w:ascii="Calibri" w:cs="Calibri" w:eastAsia="Calibri" w:hAnsi="Calibri"/>
-          <w:b w:val="1"/>
-          <w:bCs w:val="1"/>
-          <w:i w:val="0"/>
-          <w:iCs w:val="0"/>
-          <w:color w:val="1a1a2e"/>
-          <w:sz w:val="26"/>
-          <w:szCs w:val="26"/>
-          <w:rtl w:val="0"/>
-        </w:rPr>
-        <w:t xml:space="preserve">ODS 12, Producción y consumo responsables.</w:t>
-      </w:r>
-      <w:r>
-        <w:rPr>
-          <w:rFonts w:ascii="Calibri" w:cs="Calibri" w:eastAsia="Calibri" w:hAnsi="Calibri"/>
-          <w:b w:val="0"/>
-          <w:bCs w:val="0"/>
-          <w:i w:val="0"/>
-          <w:iCs w:val="0"/>
-          <w:color w:val="1a1a2e"/>
-          <w:sz w:val="26"/>
-          <w:szCs w:val="26"/>
-          <w:rtl w:val="0"/>
-        </w:rPr>
-        <w:t xml:space="preserve"> El marketplace fomenta una lógica de economía circular al promover la reutilización de materiales de obra que de otro modo podrían quedar inmovilizados o desperdiciados.</w:t>
-      </w:r>
-      <w:r>
-        <w:rPr>
-          <w:rtl w:val="0"/>
-        </w:rPr>
-      </w:r>
-    </w:p>
-    <w:p>
-      <w:pPr>
-        <w:spacing w:after="200" w:before="0" w:line="240" w:lineRule="auto"/>
-        <w:rPr/>
-      </w:pPr>
-      <w:r>
-        <w:rPr>
-          <w:rFonts w:ascii="Calibri" w:cs="Calibri" w:eastAsia="Calibri" w:hAnsi="Calibri"/>
-          <w:b w:val="1"/>
-          <w:bCs w:val="1"/>
-          <w:i w:val="0"/>
-          <w:iCs w:val="0"/>
-          <w:color w:val="1a1a2e"/>
-          <w:sz w:val="26"/>
-          <w:szCs w:val="26"/>
-          <w:rtl w:val="0"/>
-        </w:rPr>
-        <w:t xml:space="preserve">ODS 9, Industria, innovación e infraestructura.</w:t>
-      </w:r>
-      <w:r>
-        <w:rPr>
-          <w:rFonts w:ascii="Calibri" w:cs="Calibri" w:eastAsia="Calibri" w:hAnsi="Calibri"/>
-          <w:b w:val="0"/>
-          <w:bCs w:val="0"/>
-          <w:i w:val="0"/>
-          <w:iCs w:val="0"/>
-          <w:color w:val="1a1a2e"/>
-          <w:sz w:val="26"/>
-          <w:szCs w:val="26"/>
-          <w:rtl w:val="0"/>
-        </w:rPr>
-        <w:t xml:space="preserve"> HabitatIA digitaliza y moderniza una parte de los procesos de la industria de la construcción, especialmente en la etapa de preplanificación, comparación y organización de información.</w:t>
-      </w:r>
-      <w:r>
-        <w:rPr>
-          <w:rtl w:val="0"/>
-        </w:rPr>
+        <w:t>ODS 11, Ciudades y comunidades sostenibles. La plataforma mejora el acceso a una planificación habitacional más eficiente y ordenada, con herramientas que ayudan a tomar decisiones iniciales con mayor claridad. Esta contribución gana peso en una región donde cerca del 82 % de la población vive en ciudades y donde el BID estima que una proporción muy significativa de los hogares todavía no accede a una vivienda adecuada.</w:t>
+      </w:r>
+    </w:p>
+    <w:p>
+      <w:pPr>
+        <w:spacing w:after="200" w:before="0" w:line="240" w:lineRule="auto"/>
+        <w:rPr/>
+      </w:pPr>
+      <w:r>
+        <w:t>ODS 12, Producción y consumo responsables. El marketplace fomenta una lógica de economía circular al promover la reutilización de materiales de obra que de otro modo podrían quedar inmovilizados o desperdiciados. La pertinencia de este objetivo se vuelve más concreta cuando se considera que el desperdicio de materiales en construcción suele ubicarse, de manera conservadora, en un rango del 10 % al 15 %.</w:t>
+      </w:r>
+    </w:p>
+    <w:p>
+      <w:pPr>
+        <w:spacing w:after="200" w:before="0" w:line="240" w:lineRule="auto"/>
+        <w:rPr/>
+      </w:pPr>
+      <w:r>
+        <w:t>ODS 9, Industria, innovación e infraestructura. HabitatIA digitaliza y moderniza una parte de los procesos de la industria de la construcción, especialmente en la etapa de preplanificación, comparación y organización de información. En un sector con peso económico estructural y alta fragmentación operativa, mejorar trazabilidad, comparabilidad y acceso a información útil tiene impacto más allá de la experiencia individual del usuario.</w:t>
       </w:r>
     </w:p>
     <w:p>

</xml_diff>

<commit_message>
docs: refine HabitatIA TAM SAM SOM assumptions
</commit_message>
<xml_diff>
--- a/Entregable N1 HabitatIA.docx
+++ b/Entregable N1 HabitatIA.docx
@@ -1460,12 +1460,6 @@
       </w:r>
     </w:p>
     <w:p>
-      <w:pPr/>
-      <w:r>
-        <w:t>La escala regional del problema confirma que no se trata de una dificultad marginal. El Banco Interamericano de Desarrollo sostuvo recientemente que alrededor del 45 % de los hogares de América Latina y el Caribe no accede a una vivienda adecuada, en una región donde cerca del 82 % de la población ya vive en ciudades. Esta doble condición resulta especialmente relevante para HabitatIA: la presión habitacional crece en contextos urbanos densos, mientras la necesidad de tomar decisiones más informadas, más rápidas y más eficientes se vuelve cada vez más visible.</w:t>
-      </w:r>
-    </w:p>
-    <w:p>
       <w:pPr>
         <w:spacing w:after="200" w:before="0" w:line="240" w:lineRule="auto"/>
         <w:rPr/>
@@ -1567,12 +1561,6 @@
       </w:r>
     </w:p>
     <w:p>
-      <w:pPr/>
-      <w:r>
-        <w:t>Si se baja esta lectura al caso argentino, la magnitud también es contundente. La Cámara Argentina de la Construcción estimó para 2022 un déficit habitacional total cercano a 3,24 millones de viviendas. A su vez, Fundación Tejido Urbano, sobre base Censo 2022, sostuvo que alrededor de 10,7 millones de hogares urbanos, equivalentes al 73 % del total relevado, presentan al menos algún problema habitacional. Aunque ambas mediciones responden a metodologías distintas, coinciden en algo central: el universo de hogares que necesita mejorar, ampliar, reorganizar o resolver su situación habitacional es demasiado amplio como para pensar el problema como un nicho.</w:t>
-      </w:r>
-    </w:p>
-    <w:p>
       <w:pPr>
         <w:spacing w:after="200" w:before="0" w:line="240" w:lineRule="auto"/>
         <w:rPr/>
@@ -1832,7 +1820,23 @@
         <w:rPr/>
       </w:pPr>
       <w:r>
-        <w:t>La necesidad de soluciones habitacionales económicamente previsibles sigue creciendo en hogares que necesitan construir, ampliar o reorganizar su vivienda con mayor claridad. Al mismo tiempo, cambia la expectativa del usuario frente a decisiones complejas: cada vez hay más demanda de herramientas que ayuden a ordenar información, reducir incertidumbre y dar un primer paso con mayor autonomía. Esta tendencia no se apoya solo en una percepción cualitativa. Si en América Latina y el Caribe cerca del 45 % de los hogares no accede todavía a una vivienda adecuada, entonces la necesidad de herramientas que mejoren la etapa inicial de decisión no pertenece a un segmento menor, sino a una masa crítica muy amplia.</w:t>
+        <w:rPr>
+          <w:rFonts w:ascii="Calibri" w:cs="Calibri" w:eastAsia="Calibri" w:hAnsi="Calibri"/>
+          <w:b w:val="0"/>
+          <w:bCs w:val="0"/>
+          <w:i w:val="0"/>
+          <w:iCs w:val="0"/>
+          <w:color w:val="1a1a2e"/>
+          <w:sz w:val="26"/>
+          <w:szCs w:val="26"/>
+          <w:rtl w:val="0"/>
+        </w:rPr>
+        <w:t xml:space="preserve">La necesidad de soluciones habitacionales económicamente previsibles sigue creciendo en hogares que necesitan construir, ampliar o reorganizar su vivienda con mayor claridad. Al mismo tiempo, cambia la expectativa del usuario frente a decisiones complejas: cada vez hay más demanda de herramientas que ayuden a ordenar información, reducir incertidumbre y dar un primer paso con mayor autonomía.</w:t>
+      </w:r>
+      <w:r>
+        <w:rPr>
+          <w:rtl w:val="0"/>
+        </w:rPr>
       </w:r>
     </w:p>
     <w:p>
@@ -1918,7 +1922,23 @@
         <w:rPr/>
       </w:pPr>
       <w:r>
-        <w:t>El sector muestra una mayor sensibilidad frente al desperdicio, la sostenibilidad y la necesidad de experiencias de compra y decisión menos opacas. En ese marco, la reutilización de materiales y la organización de canales más eficientes para conectar oferta y demanda ganan relevancia económica y operativa. La escala económica del problema también ayuda a leer esta oportunidad con mayor precisión. El propio BID subrayó que la producción habitacional y la construcción movilizan una industria que en economías desarrolladas representa entre 5 % y 10 % del PIB. A eso se suma otra evidencia relevante para HabitatIA: la literatura y los relevamientos sectoriales ubican, de forma conservadora, el desperdicio de materiales de obra en una banda aproximada del 10 % al 15 %. Cuando ese desperdicio se combina con un mercado amplio, fragmentado y todavía poco transparente, ordenar información y recircular materiales deja de ser solo una mejora operativa y pasa a ser una oportunidad económica clara.</w:t>
+        <w:rPr>
+          <w:rFonts w:ascii="Calibri" w:cs="Calibri" w:eastAsia="Calibri" w:hAnsi="Calibri"/>
+          <w:b w:val="0"/>
+          <w:bCs w:val="0"/>
+          <w:i w:val="0"/>
+          <w:iCs w:val="0"/>
+          <w:color w:val="1a1a2e"/>
+          <w:sz w:val="26"/>
+          <w:szCs w:val="26"/>
+          <w:rtl w:val="0"/>
+        </w:rPr>
+        <w:t xml:space="preserve">El sector muestra una mayor sensibilidad frente al desperdicio, la sostenibilidad y la necesidad de experiencias de compra y decisión menos opacas. En ese marco, la reutilización de materiales y la organización de canales más eficientes para conectar oferta y demanda ganan relevancia económica y operativa.</w:t>
+      </w:r>
+      <w:r>
+        <w:rPr>
+          <w:rtl w:val="0"/>
+        </w:rPr>
       </w:r>
     </w:p>
     <w:p>
@@ -2003,25 +2023,115 @@
         <w:rPr/>
       </w:pPr>
       <w:r>
-        <w:t>ODS 11, Ciudades y comunidades sostenibles. La plataforma mejora el acceso a una planificación habitacional más eficiente y ordenada, con herramientas que ayudan a tomar decisiones iniciales con mayor claridad. Esta contribución gana peso en una región donde cerca del 82 % de la población vive en ciudades y donde el BID estima que una proporción muy significativa de los hogares todavía no accede a una vivienda adecuada.</w:t>
-      </w:r>
-    </w:p>
-    <w:p>
-      <w:pPr>
-        <w:spacing w:after="200" w:before="0" w:line="240" w:lineRule="auto"/>
-        <w:rPr/>
-      </w:pPr>
-      <w:r>
-        <w:t>ODS 12, Producción y consumo responsables. El marketplace fomenta una lógica de economía circular al promover la reutilización de materiales de obra que de otro modo podrían quedar inmovilizados o desperdiciados. La pertinencia de este objetivo se vuelve más concreta cuando se considera que el desperdicio de materiales en construcción suele ubicarse, de manera conservadora, en un rango del 10 % al 15 %.</w:t>
-      </w:r>
-    </w:p>
-    <w:p>
-      <w:pPr>
-        <w:spacing w:after="200" w:before="0" w:line="240" w:lineRule="auto"/>
-        <w:rPr/>
-      </w:pPr>
-      <w:r>
-        <w:t>ODS 9, Industria, innovación e infraestructura. HabitatIA digitaliza y moderniza una parte de los procesos de la industria de la construcción, especialmente en la etapa de preplanificación, comparación y organización de información. En un sector con peso económico estructural y alta fragmentación operativa, mejorar trazabilidad, comparabilidad y acceso a información útil tiene impacto más allá de la experiencia individual del usuario.</w:t>
+        <w:rPr>
+          <w:rFonts w:ascii="Calibri" w:cs="Calibri" w:eastAsia="Calibri" w:hAnsi="Calibri"/>
+          <w:b w:val="1"/>
+          <w:bCs w:val="1"/>
+          <w:i w:val="0"/>
+          <w:iCs w:val="0"/>
+          <w:color w:val="1a1a2e"/>
+          <w:sz w:val="26"/>
+          <w:szCs w:val="26"/>
+          <w:rtl w:val="0"/>
+        </w:rPr>
+        <w:t xml:space="preserve">ODS 11, Ciudades y comunidades sostenibles.</w:t>
+      </w:r>
+      <w:r>
+        <w:rPr>
+          <w:rFonts w:ascii="Calibri" w:cs="Calibri" w:eastAsia="Calibri" w:hAnsi="Calibri"/>
+          <w:b w:val="0"/>
+          <w:bCs w:val="0"/>
+          <w:i w:val="0"/>
+          <w:iCs w:val="0"/>
+          <w:color w:val="1a1a2e"/>
+          <w:sz w:val="26"/>
+          <w:szCs w:val="26"/>
+          <w:rtl w:val="0"/>
+        </w:rPr>
+        <w:t xml:space="preserve"> La plataforma mejora el acceso a una planificación habitacional más eficiente y ordenada, con herramientas que ayudan a tomar decisiones iniciales con mayor claridad.</w:t>
+      </w:r>
+      <w:r>
+        <w:rPr>
+          <w:rtl w:val="0"/>
+        </w:rPr>
+      </w:r>
+    </w:p>
+    <w:p>
+      <w:pPr>
+        <w:spacing w:after="200" w:before="0" w:line="240" w:lineRule="auto"/>
+        <w:rPr/>
+      </w:pPr>
+      <w:r>
+        <w:rPr>
+          <w:rFonts w:ascii="Calibri" w:cs="Calibri" w:eastAsia="Calibri" w:hAnsi="Calibri"/>
+          <w:b w:val="1"/>
+          <w:bCs w:val="1"/>
+          <w:i w:val="0"/>
+          <w:iCs w:val="0"/>
+          <w:color w:val="1a1a2e"/>
+          <w:sz w:val="26"/>
+          <w:szCs w:val="26"/>
+          <w:rtl w:val="0"/>
+        </w:rPr>
+        <w:t xml:space="preserve">ODS 12, Producción y consumo responsables.</w:t>
+      </w:r>
+      <w:r>
+        <w:rPr>
+          <w:rFonts w:ascii="Calibri" w:cs="Calibri" w:eastAsia="Calibri" w:hAnsi="Calibri"/>
+          <w:b w:val="0"/>
+          <w:bCs w:val="0"/>
+          <w:i w:val="0"/>
+          <w:iCs w:val="0"/>
+          <w:color w:val="1a1a2e"/>
+          <w:sz w:val="26"/>
+          <w:szCs w:val="26"/>
+          <w:rtl w:val="0"/>
+        </w:rPr>
+        <w:t xml:space="preserve"> El marketplace fomenta una lógica de economía circular al promover la reutilización de materiales de obra que de otro modo podrían quedar inmovilizados o desperdiciados.</w:t>
+      </w:r>
+      <w:r>
+        <w:rPr>
+          <w:rtl w:val="0"/>
+        </w:rPr>
+      </w:r>
+    </w:p>
+    <w:p>
+      <w:pPr>
+        <w:spacing w:after="200" w:before="0" w:line="240" w:lineRule="auto"/>
+        <w:rPr/>
+      </w:pPr>
+      <w:r>
+        <w:rPr>
+          <w:rFonts w:ascii="Calibri" w:cs="Calibri" w:eastAsia="Calibri" w:hAnsi="Calibri"/>
+          <w:b w:val="1"/>
+          <w:bCs w:val="1"/>
+          <w:i w:val="0"/>
+          <w:iCs w:val="0"/>
+          <w:color w:val="1a1a2e"/>
+          <w:sz w:val="26"/>
+          <w:szCs w:val="26"/>
+          <w:rtl w:val="0"/>
+        </w:rPr>
+        <w:t xml:space="preserve">ODS 9, Industria, innovación e infraestructura.</w:t>
+      </w:r>
+      <w:r>
+        <w:rPr>
+          <w:rFonts w:ascii="Calibri" w:cs="Calibri" w:eastAsia="Calibri" w:hAnsi="Calibri"/>
+          <w:b w:val="0"/>
+          <w:bCs w:val="0"/>
+          <w:i w:val="0"/>
+          <w:iCs w:val="0"/>
+          <w:color w:val="1a1a2e"/>
+          <w:sz w:val="26"/>
+          <w:szCs w:val="26"/>
+          <w:rtl w:val="0"/>
+        </w:rPr>
+        <w:t xml:space="preserve"> HabitatIA digitaliza y moderniza una parte de los procesos de la industria de la construcción, especialmente en la etapa de preplanificación, comparación y organización de información.</w:t>
+      </w:r>
+      <w:r>
+        <w:rPr>
+          <w:rtl w:val="0"/>
+        </w:rPr>
       </w:r>
     </w:p>
     <w:p>
@@ -15217,82 +15327,82 @@
           <w:szCs w:val="26"/>
           <w:rtl w:val="0"/>
         </w:rPr>
-        <w:t xml:space="preserve">En una definición amplia, el mercado total direccionable de HabitatIA incluye a todas las personas, familias y organizaciones que participan del proceso de diseñar, construir, ampliar o mejorar una vivienda, así como a los actores que disponen de materiales de construcción potencialmente reutilizables. Se trata de un universo muy grande por al menos cuatro razones:</w:t>
-      </w:r>
-      <w:r>
-        <w:rPr>
-          <w:rtl w:val="0"/>
-        </w:rPr>
-      </w:r>
-    </w:p>
-    <w:p>
-      <w:pPr>
-        <w:spacing w:after="200" w:before="0" w:line="240" w:lineRule="auto"/>
-        <w:rPr/>
-      </w:pPr>
-      <w:r>
-        <w:rPr>
-          <w:rFonts w:ascii="Calibri" w:cs="Calibri" w:eastAsia="Calibri" w:hAnsi="Calibri"/>
-          <w:b w:val="0"/>
-          <w:bCs w:val="0"/>
-          <w:i w:val="0"/>
-          <w:iCs w:val="0"/>
-          <w:color w:val="1a1a2e"/>
-          <w:sz w:val="26"/>
-          <w:szCs w:val="26"/>
-          <w:rtl w:val="0"/>
-        </w:rPr>
-        <w:t xml:space="preserve">Si se busca darle escala cuantitativa a esta capa amplia, el dato estructural más relevante es el problema habitacional argentino. Distintas fuentes permiten mostrar que no se trata de un nicho pequeño. Por un lado, la Cámara Argentina de la Construcción estimó para 2022 un déficit habitacional total cercano a 3,24 millones de viviendas. Por otro, una lectura más amplia de Fundación Tejido Urbano sobre base Censo 2022 sostuvo que alrededor de 10,7 millones de hogares urbanos, equivalentes al 73 % del total relevado, presentan al menos algún problema habitacional. Aunque ambas fuentes usan metodologías y alcances distintos, coinciden en un punto clave: el universo de hogares con necesidad de mejora, ampliación, reorganización o acceso habitacional es masivo.</w:t>
-      </w:r>
-      <w:r>
-        <w:rPr>
-          <w:rtl w:val="0"/>
-        </w:rPr>
-      </w:r>
-    </w:p>
-    <w:p>
-      <w:pPr>
-        <w:spacing w:after="200" w:before="0" w:line="240" w:lineRule="auto"/>
-        <w:rPr/>
-      </w:pPr>
-      <w:r>
-        <w:rPr>
-          <w:rFonts w:ascii="Calibri" w:cs="Calibri" w:eastAsia="Calibri" w:hAnsi="Calibri"/>
-          <w:b w:val="0"/>
-          <w:bCs w:val="0"/>
-          <w:i w:val="0"/>
-          <w:iCs w:val="0"/>
-          <w:color w:val="1a1a2e"/>
-          <w:sz w:val="26"/>
-          <w:szCs w:val="26"/>
-          <w:rtl w:val="0"/>
-        </w:rPr>
-        <w:t xml:space="preserve">Para HabitatIA, este dato es estratégico porque el TAM no debe leerse solo como “viviendas nuevas a construir”, sino como el conjunto de decisiones habitacionales que requieren claridad inicial, visualización, estimación de costos y potencial optimización económica. En ese sentido, el mercado total también incluye ampliaciones, refacciones y mejoras progresivas, además de la demanda asociada a materiales reutilizables provenientes de obras ya ejecutadas.</w:t>
-      </w:r>
-      <w:r>
-        <w:rPr>
-          <w:rtl w:val="0"/>
-        </w:rPr>
-      </w:r>
-    </w:p>
-    <w:p>
-      <w:pPr>
-        <w:spacing w:after="200" w:before="0" w:line="240" w:lineRule="auto"/>
-        <w:rPr/>
-      </w:pPr>
-      <w:r>
-        <w:rPr>
-          <w:rFonts w:ascii="Calibri" w:cs="Calibri" w:eastAsia="Calibri" w:hAnsi="Calibri"/>
-          <w:b w:val="0"/>
-          <w:bCs w:val="0"/>
-          <w:i w:val="0"/>
-          <w:iCs w:val="0"/>
-          <w:color w:val="1a1a2e"/>
-          <w:sz w:val="26"/>
-          <w:szCs w:val="26"/>
-          <w:rtl w:val="0"/>
-        </w:rPr>
-        <w:t xml:space="preserve">Sin embargo, la utilidad del TAM es principalmente contextual. Sirve para mostrar que HabitatIA no opera en un nicho artificial o marginal. No alcanza, por sí solo, para justificar una estrategia concreta.</w:t>
+        <w:t>En una definición amplia, el mercado total direccionable de HabitatIA incluye a todas las personas, familias y organizaciones que participan del proceso de diseñar, construir, ampliar o mejorar una vivienda, así como a los actores que disponen de materiales de construcción potencialmente reutilizables. La lectura correcta del TAM no es la de un nicho puntual, sino la de un problema habitacional masivo con múltiples puertas de entrada.</w:t>
+      </w:r>
+      <w:r>
+        <w:rPr>
+          <w:rtl w:val="0"/>
+        </w:rPr>
+      </w:r>
+    </w:p>
+    <w:p>
+      <w:pPr>
+        <w:spacing w:after="200" w:before="0" w:line="240" w:lineRule="auto"/>
+        <w:rPr/>
+      </w:pPr>
+      <w:r>
+        <w:rPr>
+          <w:rFonts w:ascii="Calibri" w:cs="Calibri" w:eastAsia="Calibri" w:hAnsi="Calibri"/>
+          <w:b w:val="0"/>
+          <w:bCs w:val="0"/>
+          <w:i w:val="0"/>
+          <w:iCs w:val="0"/>
+          <w:color w:val="1a1a2e"/>
+          <w:sz w:val="26"/>
+          <w:szCs w:val="26"/>
+          <w:rtl w:val="0"/>
+        </w:rPr>
+        <w:t>Si se busca darle escala cuantitativa a esta capa amplia, el dato estructural más sólido sigue siendo el problema habitacional argentino. Por un lado, la Cámara Argentina de la Construcción estimó para 2022 un déficit habitacional total cercano a 3,24 millones de viviendas. Por otro, Fundación Tejido Urbano, sobre base Censo 2022, sostuvo que alrededor de 10,7 millones de hogares urbanos, equivalentes al 73 % del total relevado, presentan al menos algún problema habitacional. Leído en conjunto, esto permite trabajar con dos niveles de TAM: un núcleo crítico de 3,24 millones de hogares con déficit fuerte y un universo amplio de 10,7 millones de hogares con necesidades de mejora, ampliación, reorganización o acceso habitacional.</w:t>
+      </w:r>
+      <w:r>
+        <w:rPr>
+          <w:rtl w:val="0"/>
+        </w:rPr>
+      </w:r>
+    </w:p>
+    <w:p>
+      <w:pPr>
+        <w:spacing w:after="200" w:before="0" w:line="240" w:lineRule="auto"/>
+        <w:rPr/>
+      </w:pPr>
+      <w:r>
+        <w:rPr>
+          <w:rFonts w:ascii="Calibri" w:cs="Calibri" w:eastAsia="Calibri" w:hAnsi="Calibri"/>
+          <w:b w:val="0"/>
+          <w:bCs w:val="0"/>
+          <w:i w:val="0"/>
+          <w:iCs w:val="0"/>
+          <w:color w:val="1a1a2e"/>
+          <w:sz w:val="26"/>
+          <w:szCs w:val="26"/>
+          <w:rtl w:val="0"/>
+        </w:rPr>
+        <w:t>Para HabitatIA, este dato es estratégico porque el TAM no debe leerse solo como “viviendas nuevas a construir”, sino como el conjunto de decisiones habitacionales que requieren claridad inicial, visualización, estimación de costos y potencial optimización económica. En ese sentido, el mercado total también incluye ampliaciones, refacciones y mejoras progresivas, además de la demanda asociada a materiales reutilizables provenientes de obras ya ejecutadas.</w:t>
+      </w:r>
+      <w:r>
+        <w:rPr>
+          <w:rtl w:val="0"/>
+        </w:rPr>
+      </w:r>
+    </w:p>
+    <w:p>
+      <w:pPr>
+        <w:spacing w:after="200" w:before="0" w:line="240" w:lineRule="auto"/>
+        <w:rPr/>
+      </w:pPr>
+      <w:r>
+        <w:rPr>
+          <w:rFonts w:ascii="Calibri" w:cs="Calibri" w:eastAsia="Calibri" w:hAnsi="Calibri"/>
+          <w:b w:val="0"/>
+          <w:bCs w:val="0"/>
+          <w:i w:val="0"/>
+          <w:iCs w:val="0"/>
+          <w:color w:val="1a1a2e"/>
+          <w:sz w:val="26"/>
+          <w:szCs w:val="26"/>
+          <w:rtl w:val="0"/>
+        </w:rPr>
+        <w:t>La utilidad del TAM sigue siendo principalmente contextual, pero ahora con una lectura más defendible: no se trata de afirmar que HabitatIA puede capturar millones de usuarios, sino de mostrar que opera sobre una necesidad estructural, persistente y cuantificable. Esa escala de problema es consistente, además, con los hallazgos del proceso de validación, donde la incertidumbre presupuestaria, la dificultad para definir materiales y la necesidad de ordenar la decisión aparecieron de forma reiterada.</w:t>
       </w:r>
       <w:r>
         <w:rPr>
@@ -15343,7 +15453,7 @@
           <w:szCs w:val="26"/>
           <w:rtl w:val="0"/>
         </w:rPr>
-        <w:t xml:space="preserve">El SAM de HabitatIA debe estar definido por los segmentos a los que el proyecto puede servir en una primera etapa con una propuesta plausible y defendible. Desde esa perspectiva, el mercado disponible servible incluye principalmente:</w:t>
+        <w:t>El SAM de HabitatIA debe definirse como la parte del mercado a la que el proyecto podría servir razonablemente en una primera etapa con una propuesta plausible, defendible y operativamente alcanzable. Desde esa perspectiva, el mercado disponible servible incluye principalmente:</w:t>
       </w:r>
       <w:r>
         <w:rPr>
@@ -15373,7 +15483,7 @@
           <w:szCs w:val="26"/>
           <w:rtl w:val="0"/>
         </w:rPr>
-        <w:t xml:space="preserve">hogares con intención de construir o ampliar una vivienda y alta sensibilidad al costo;</w:t>
+        <w:t>hogares con intención de construir o ampliar una vivienda y alta sensibilidad al costo;</w:t>
       </w:r>
       <w:r>
         <w:rPr>
@@ -15403,7 +15513,7 @@
           <w:szCs w:val="26"/>
           <w:rtl w:val="0"/>
         </w:rPr>
-        <w:t xml:space="preserve">personas con terreno propio que necesitan una primera traducción de su idea en proyecto;</w:t>
+        <w:t>personas con terreno propio que necesitan una primera traducción de su idea en proyecto;</w:t>
       </w:r>
       <w:r>
         <w:rPr>
@@ -15433,7 +15543,7 @@
           <w:szCs w:val="26"/>
           <w:rtl w:val="0"/>
         </w:rPr>
-        <w:t xml:space="preserve">arquitectos, estudios y profesionales con materiales sobrantes de obras recientes;</w:t>
+        <w:t>arquitectos, estudios y profesionales con materiales sobrantes de obras recientes;</w:t>
       </w:r>
       <w:r>
         <w:rPr>
@@ -15463,82 +15573,82 @@
           <w:szCs w:val="26"/>
           <w:rtl w:val="0"/>
         </w:rPr>
-        <w:t xml:space="preserve">pequeños constructores y desarrolladores con interés en optimización de costos.</w:t>
-      </w:r>
-      <w:r>
-        <w:rPr>
-          <w:rtl w:val="0"/>
-        </w:rPr>
-      </w:r>
-    </w:p>
-    <w:p>
-      <w:pPr>
-        <w:spacing w:after="200" w:before="0" w:line="240" w:lineRule="auto"/>
-        <w:rPr/>
-      </w:pPr>
-      <w:r>
-        <w:rPr>
-          <w:rFonts w:ascii="Calibri" w:cs="Calibri" w:eastAsia="Calibri" w:hAnsi="Calibri"/>
-          <w:b w:val="0"/>
-          <w:bCs w:val="0"/>
-          <w:i w:val="0"/>
-          <w:iCs w:val="0"/>
-          <w:color w:val="1a1a2e"/>
-          <w:sz w:val="26"/>
-          <w:szCs w:val="26"/>
-          <w:rtl w:val="0"/>
-        </w:rPr>
-        <w:t xml:space="preserve">Si se busca aproximar esta capa con números reales, una referencia útil surge de combinar dos indicadores. Según INDEC para el segundo semestre de 2023, el 60,2 % de los hogares en los 31 aglomerados urbanos eran propietarios de la vivienda y el terreno. Si ese dato se cruza, de forma orientativa, con la estimación amplia de 10,7 millones de hogares urbanos con algún problema habitacional, aparece una base potencial del orden de 6,4 millones de hogares que ya cuentan con una condición de tenencia más favorable para encarar mejoras, ampliaciones o construcción incremental, pero siguen enfrentando restricciones habitacionales.</w:t>
-      </w:r>
-      <w:r>
-        <w:rPr>
-          <w:rtl w:val="0"/>
-        </w:rPr>
-      </w:r>
-    </w:p>
-    <w:p>
-      <w:pPr>
-        <w:spacing w:after="200" w:before="0" w:line="240" w:lineRule="auto"/>
-        <w:rPr/>
-      </w:pPr>
-      <w:r>
-        <w:rPr>
-          <w:rFonts w:ascii="Calibri" w:cs="Calibri" w:eastAsia="Calibri" w:hAnsi="Calibri"/>
-          <w:b w:val="0"/>
-          <w:bCs w:val="0"/>
-          <w:i w:val="0"/>
-          <w:iCs w:val="0"/>
-          <w:color w:val="1a1a2e"/>
-          <w:sz w:val="26"/>
-          <w:szCs w:val="26"/>
-          <w:rtl w:val="0"/>
-        </w:rPr>
-        <w:t xml:space="preserve">Ese número no equivale automáticamente al mercado efectivo de HabitatIA, porque no todos esos hogares estarán en etapa activa de obra ni todos pertenecerán al segmento de ingresos más compatible con una primera adopción digital. Sin embargo, funciona como proxy robusta para el SAM: muestra que existe un subconjunto muy amplio de hogares que no parten desde cero en términos de tenencia y que, precisamente por eso, tienen mayor probabilidad de necesitar herramientas para proyectar, ampliar, construir por etapas u optimizar costos. Allí es donde HabitatIA encuentra su espacio más lógico de entrada, especialmente en sectores medios y medios-bajos con alta sensibilidad al error presupuestario.</w:t>
-      </w:r>
-      <w:r>
-        <w:rPr>
-          <w:rtl w:val="0"/>
-        </w:rPr>
-      </w:r>
-    </w:p>
-    <w:p>
-      <w:pPr>
-        <w:spacing w:after="200" w:before="0" w:line="240" w:lineRule="auto"/>
-        <w:rPr/>
-      </w:pPr>
-      <w:r>
-        <w:rPr>
-          <w:rFonts w:ascii="Calibri" w:cs="Calibri" w:eastAsia="Calibri" w:hAnsi="Calibri"/>
-          <w:b w:val="0"/>
-          <w:bCs w:val="0"/>
-          <w:i w:val="0"/>
-          <w:iCs w:val="0"/>
-          <w:color w:val="1a1a2e"/>
-          <w:sz w:val="26"/>
-          <w:szCs w:val="26"/>
-          <w:rtl w:val="0"/>
-        </w:rPr>
-        <w:t xml:space="preserve">Este recorte es importante porque ubica el proyecto en un espacio alcanzable. La ambición no es resolver “todo el mercado de la construcción”, sino crear valor en un segmento donde la propuesta de diseño preliminar más ahorro puede tener mayor tracción inicial.</w:t>
+        <w:t>pequeños constructores y desarrolladores con interés en optimización de costos.</w:t>
+      </w:r>
+      <w:r>
+        <w:rPr>
+          <w:rtl w:val="0"/>
+        </w:rPr>
+      </w:r>
+    </w:p>
+    <w:p>
+      <w:pPr>
+        <w:spacing w:after="200" w:before="0" w:line="240" w:lineRule="auto"/>
+        <w:rPr/>
+      </w:pPr>
+      <w:r>
+        <w:rPr>
+          <w:rFonts w:ascii="Calibri" w:cs="Calibri" w:eastAsia="Calibri" w:hAnsi="Calibri"/>
+          <w:b w:val="0"/>
+          <w:bCs w:val="0"/>
+          <w:i w:val="0"/>
+          <w:iCs w:val="0"/>
+          <w:color w:val="1a1a2e"/>
+          <w:sz w:val="26"/>
+          <w:szCs w:val="26"/>
+          <w:rtl w:val="0"/>
+        </w:rPr>
+        <w:t>Si se busca aproximar esta capa con números reales, una referencia útil surge de combinar dos indicadores. Según INDEC para el segundo semestre de 2023, el 60,2 % de los hogares en los 31 aglomerados urbanos eran propietarios de la vivienda y el terreno. Si ese dato se cruza, de forma orientativa, con la estimación amplia de 10,7 millones de hogares urbanos con algún problema habitacional, aparece una base potencial del orden de 6,4 millones de hogares que ya cuentan con una condición de tenencia más favorable para encarar mejoras, ampliaciones o construcción incremental, pero siguen enfrentando restricciones habitacionales.</w:t>
+      </w:r>
+      <w:r>
+        <w:rPr>
+          <w:rtl w:val="0"/>
+        </w:rPr>
+      </w:r>
+    </w:p>
+    <w:p>
+      <w:pPr>
+        <w:spacing w:after="200" w:before="0" w:line="240" w:lineRule="auto"/>
+        <w:rPr/>
+      </w:pPr>
+      <w:r>
+        <w:rPr>
+          <w:rFonts w:ascii="Calibri" w:cs="Calibri" w:eastAsia="Calibri" w:hAnsi="Calibri"/>
+          <w:b w:val="0"/>
+          <w:bCs w:val="0"/>
+          <w:i w:val="0"/>
+          <w:iCs w:val="0"/>
+          <w:color w:val="1a1a2e"/>
+          <w:sz w:val="26"/>
+          <w:szCs w:val="26"/>
+          <w:rtl w:val="0"/>
+        </w:rPr>
+        <w:t>Para no sobredimensionar ese número, conviene aplicar dos filtros explícitos. Primero, asumir que solo una fracción de esa base estará en una ventana activa de decisión de obra, ampliación o refacción en un año dado. Un supuesto prudente para una etapa temprana puede ubicarse entre 10 % y 12 %. Segundo, asumir que solo una parte de ese grupo tendrá un perfil compatible con una primera adopción digital de una herramienta como HabitatIA; como supuesto conservador, puede trabajarse con un rango del 20 % al 25 %. Bajo ese criterio, el SAM operativo anual razonable queda aproximadamente entre 128.000 y 192.000 hogares, con un punto de trabajo defendible en torno a 160.000 hogares.</w:t>
+      </w:r>
+      <w:r>
+        <w:rPr>
+          <w:rtl w:val="0"/>
+        </w:rPr>
+      </w:r>
+    </w:p>
+    <w:p>
+      <w:pPr>
+        <w:spacing w:after="200" w:before="0" w:line="240" w:lineRule="auto"/>
+        <w:rPr/>
+      </w:pPr>
+      <w:r>
+        <w:rPr>
+          <w:rFonts w:ascii="Calibri" w:cs="Calibri" w:eastAsia="Calibri" w:hAnsi="Calibri"/>
+          <w:b w:val="0"/>
+          <w:bCs w:val="0"/>
+          <w:i w:val="0"/>
+          <w:iCs w:val="0"/>
+          <w:color w:val="1a1a2e"/>
+          <w:sz w:val="26"/>
+          <w:szCs w:val="26"/>
+          <w:rtl w:val="0"/>
+        </w:rPr>
+        <w:t>Este recorte es más útil que una cifra amplia sin filtros, porque deja claros los supuestos y conecta mejor con la validación obtenida. Las entrevistas realizadas muestran que la propuesta resuena con más fuerza en perfiles que ya están cerca de decidir, sienten presión por el costo total, necesitan claridad sobre materiales y valoran una herramienta que reduzca incertidumbre desde el inicio. Allí es donde HabitatIA encuentra su espacio de entrada más lógico.</w:t>
       </w:r>
       <w:r>
         <w:rPr>
@@ -15589,32 +15699,32 @@
           <w:szCs w:val="26"/>
           <w:rtl w:val="0"/>
         </w:rPr>
-        <w:t xml:space="preserve">El SOM, o mercado obtenible, representa la porción que HabitatIA podría captar efectivamente en una etapa inicial. En este tipo de proyectos, es más sensato pensar el SOM en términos de masa crítica funcional que en participación porcentual ambiciosa. Es decir, más importante que una cuota abstracta es contar con una base inicial suficiente para demostrar uso, generar casos de valor y activar el marketplace.</w:t>
-      </w:r>
-      <w:r>
-        <w:rPr>
-          <w:rtl w:val="0"/>
-        </w:rPr>
-      </w:r>
-    </w:p>
-    <w:p>
-      <w:pPr>
-        <w:spacing w:after="200" w:before="0" w:line="240" w:lineRule="auto"/>
-        <w:rPr/>
-      </w:pPr>
-      <w:r>
-        <w:rPr>
-          <w:rFonts w:ascii="Calibri" w:cs="Calibri" w:eastAsia="Calibri" w:hAnsi="Calibri"/>
-          <w:b w:val="0"/>
-          <w:bCs w:val="0"/>
-          <w:i w:val="0"/>
-          <w:iCs w:val="0"/>
-          <w:color w:val="1a1a2e"/>
-          <w:sz w:val="26"/>
-          <w:szCs w:val="26"/>
-          <w:rtl w:val="0"/>
-        </w:rPr>
-        <w:t xml:space="preserve">Un SOM razonable en términos conceptuales podría expresarse como:</w:t>
+        <w:t>El SOM, o mercado obtenible, representa la porción que HabitatIA podría captar efectivamente dentro de ese SAM. En este punto ya no alcanza con hablar de “masa crítica”; también conviene explicitar una meta de captura defendible para el año 5.</w:t>
+      </w:r>
+      <w:r>
+        <w:rPr>
+          <w:rtl w:val="0"/>
+        </w:rPr>
+      </w:r>
+    </w:p>
+    <w:p>
+      <w:pPr>
+        <w:spacing w:after="200" w:before="0" w:line="240" w:lineRule="auto"/>
+        <w:rPr/>
+      </w:pPr>
+      <w:r>
+        <w:rPr>
+          <w:rFonts w:ascii="Calibri" w:cs="Calibri" w:eastAsia="Calibri" w:hAnsi="Calibri"/>
+          <w:b w:val="0"/>
+          <w:bCs w:val="0"/>
+          <w:i w:val="0"/>
+          <w:iCs w:val="0"/>
+          <w:color w:val="1a1a2e"/>
+          <w:sz w:val="26"/>
+          <w:szCs w:val="26"/>
+          <w:rtl w:val="0"/>
+        </w:rPr>
+        <w:t>Si se evita una proyección grandilocuente y se trabaja con los filtros anteriores, un escenario base razonable para HabitatIA podría expresarse así:</w:t>
       </w:r>
       <w:r>
         <w:rPr>
@@ -15644,7 +15754,7 @@
           <w:szCs w:val="26"/>
           <w:rtl w:val="0"/>
         </w:rPr>
-        <w:t xml:space="preserve">primeros usuarios que completen el flujo y encuentren valor en la propuesta generada;</w:t>
+        <w:t>tomar como objetivo al año 5 una captación acumulada equivalente al 0,2 % del SAM amplio estimado, lo que representa aproximadamente 12.800 hogares;</w:t>
       </w:r>
       <w:r>
         <w:rPr>
@@ -15674,7 +15784,7 @@
           <w:szCs w:val="26"/>
           <w:rtl w:val="0"/>
         </w:rPr>
-        <w:t xml:space="preserve">primeros oferentes de materiales capaces de poblar el marketplace con publicaciones útiles;</w:t>
+        <w:t>esa misma meta equivale, en términos operativos, a alrededor del 8 % del SAM operativo anual de referencia de 160.000 hogares, una proporción exigente pero plausible para una categoría de alta necesidad y decisión lenta;</w:t>
       </w:r>
       <w:r>
         <w:rPr>
@@ -15704,7 +15814,7 @@
           <w:szCs w:val="26"/>
           <w:rtl w:val="0"/>
         </w:rPr>
-        <w:t xml:space="preserve">primeras coincidencias exitosas entre necesidades de proyectos y materiales ofrecidos;</w:t>
+        <w:t>suponer una entrada focalizada en segmentos propietarios, urbanos y con fuerte sensibilidad al error presupuestario, donde la propuesta de claridad inicial y ahorro potencial tiene mayor probabilidad de adopción;</w:t>
       </w:r>
       <w:r>
         <w:rPr>
@@ -15734,7 +15844,7 @@
           <w:szCs w:val="26"/>
           <w:rtl w:val="0"/>
         </w:rPr>
-        <w:t xml:space="preserve">primeras señales de repetición o recomendación.</w:t>
+        <w:t>validar la captura no solo por registros o interés declarado, sino por hogares que completan el flujo, reciben una propuesta útil, vuelven a interactuar, recomiendan la herramienta o generan transacciones en el marketplace.</w:t>
       </w:r>
       <w:r>
         <w:rPr>

</xml_diff>

<commit_message>
docs: clarify HabitatIA monetization model
</commit_message>
<xml_diff>
--- a/Entregable N1 HabitatIA.docx
+++ b/Entregable N1 HabitatIA.docx
@@ -18507,77 +18507,72 @@
           <w:szCs w:val="26"/>
           <w:rtl w:val="0"/>
         </w:rPr>
-        <w:t xml:space="preserve">Para usuarios finales</w:t>
-      </w:r>
-      <w:r>
-        <w:rPr>
-          <w:rFonts w:ascii="Calibri" w:cs="Calibri" w:eastAsia="Calibri" w:hAnsi="Calibri"/>
-          <w:b w:val="0"/>
-          <w:bCs w:val="0"/>
-          <w:i w:val="0"/>
-          <w:iCs w:val="0"/>
-          <w:color w:val="1a1a2e"/>
-          <w:sz w:val="26"/>
-          <w:szCs w:val="26"/>
-          <w:rtl w:val="0"/>
-        </w:rPr>
-        <w:t xml:space="preserve">, HabitatIA podría ofrecer versiones premium con más alternativas, estilos adicionales, nuevas distribuciones, reportes más detallados o simulaciones económicas más profundas. </w:t>
-      </w:r>
-      <w:r>
-        <w:rPr>
-          <w:rFonts w:ascii="Calibri" w:cs="Calibri" w:eastAsia="Calibri" w:hAnsi="Calibri"/>
-          <w:b w:val="1"/>
-          <w:bCs w:val="1"/>
-          <w:i w:val="0"/>
-          <w:iCs w:val="0"/>
-          <w:color w:val="1a1a2e"/>
-          <w:sz w:val="26"/>
-          <w:szCs w:val="26"/>
-          <w:rtl w:val="0"/>
-        </w:rPr>
-        <w:t xml:space="preserve">Para profesionales</w:t>
-      </w:r>
-      <w:r>
-        <w:rPr>
-          <w:rFonts w:ascii="Calibri" w:cs="Calibri" w:eastAsia="Calibri" w:hAnsi="Calibri"/>
-          <w:b w:val="0"/>
-          <w:bCs w:val="0"/>
-          <w:i w:val="0"/>
-          <w:iCs w:val="0"/>
-          <w:color w:val="1a1a2e"/>
-          <w:sz w:val="26"/>
-          <w:szCs w:val="26"/>
-          <w:rtl w:val="0"/>
-        </w:rPr>
-        <w:t xml:space="preserve">, podría sumar publicaciones destacadas, mayor visibilidad, herramientas analíticas o una interfaz de gestión más robusta. </w:t>
-      </w:r>
-      <w:r>
-        <w:rPr>
-          <w:rFonts w:ascii="Calibri" w:cs="Calibri" w:eastAsia="Calibri" w:hAnsi="Calibri"/>
-          <w:b w:val="1"/>
-          <w:bCs w:val="1"/>
-          <w:i w:val="0"/>
-          <w:iCs w:val="0"/>
-          <w:color w:val="1a1a2e"/>
-          <w:sz w:val="26"/>
-          <w:szCs w:val="26"/>
-          <w:rtl w:val="0"/>
-        </w:rPr>
-        <w:t xml:space="preserve">Como capa opcional</w:t>
-      </w:r>
-      <w:r>
-        <w:rPr>
-          <w:rFonts w:ascii="Calibri" w:cs="Calibri" w:eastAsia="Calibri" w:hAnsi="Calibri"/>
-          <w:b w:val="0"/>
-          <w:bCs w:val="0"/>
-          <w:i w:val="0"/>
-          <w:iCs w:val="0"/>
-          <w:color w:val="1a1a2e"/>
-          <w:sz w:val="26"/>
-          <w:szCs w:val="26"/>
-          <w:rtl w:val="0"/>
-        </w:rPr>
-        <w:t xml:space="preserve">, más adelante también podría incorporar soporte humano o vinculación con profesionales para cerrar la brecha entre la propuesta preliminar y la siguiente etapa técnica.</w:t>
+        <w:t>Para usuarios finales, HabitatIA podría ofrecer una capa premium claramente definida. La hipótesis trabajada hasta ahora es cobrar cuando el usuario quiera profundizar y descargar entregables concretos, en particular el cómputo detallado en Excel, un reporte ampliado y variantes comparativas básicas. Como referencia preliminar, ese plan pago podría ubicarse entre ARS 25.000 y ARS 40.000 por proyecto, con un punto de entrada sugerido en ARS 29.900. Para profesionales, podría sumar publicaciones destacadas, mayor visibilidad, herramientas analíticas o una interfaz de gestión más robusta. Como capa opcional, más adelante también podría incorporar soporte humano o vinculación con profesionales para cerrar la brecha entre la propuesta preliminar y la siguiente etapa técnica.</w:t>
+      </w:r>
+      <w:r>
+        <w:rPr>
+          <w:rFonts w:ascii="Calibri" w:cs="Calibri" w:eastAsia="Calibri" w:hAnsi="Calibri"/>
+          <w:b w:val="0"/>
+          <w:bCs w:val="0"/>
+          <w:i w:val="0"/>
+          <w:iCs w:val="0"/>
+          <w:color w:val="1a1a2e"/>
+          <w:sz w:val="26"/>
+          <w:szCs w:val="26"/>
+          <w:rtl w:val="0"/>
+        </w:rPr>
+      </w:r>
+      <w:r>
+        <w:rPr>
+          <w:rFonts w:ascii="Calibri" w:cs="Calibri" w:eastAsia="Calibri" w:hAnsi="Calibri"/>
+          <w:b w:val="1"/>
+          <w:bCs w:val="1"/>
+          <w:i w:val="0"/>
+          <w:iCs w:val="0"/>
+          <w:color w:val="1a1a2e"/>
+          <w:sz w:val="26"/>
+          <w:szCs w:val="26"/>
+          <w:rtl w:val="0"/>
+        </w:rPr>
+      </w:r>
+      <w:r>
+        <w:rPr>
+          <w:rFonts w:ascii="Calibri" w:cs="Calibri" w:eastAsia="Calibri" w:hAnsi="Calibri"/>
+          <w:b w:val="0"/>
+          <w:bCs w:val="0"/>
+          <w:i w:val="0"/>
+          <w:iCs w:val="0"/>
+          <w:color w:val="1a1a2e"/>
+          <w:sz w:val="26"/>
+          <w:szCs w:val="26"/>
+          <w:rtl w:val="0"/>
+        </w:rPr>
+      </w:r>
+      <w:r>
+        <w:rPr>
+          <w:rFonts w:ascii="Calibri" w:cs="Calibri" w:eastAsia="Calibri" w:hAnsi="Calibri"/>
+          <w:b w:val="1"/>
+          <w:bCs w:val="1"/>
+          <w:i w:val="0"/>
+          <w:iCs w:val="0"/>
+          <w:color w:val="1a1a2e"/>
+          <w:sz w:val="26"/>
+          <w:szCs w:val="26"/>
+          <w:rtl w:val="0"/>
+        </w:rPr>
+      </w:r>
+      <w:r>
+        <w:rPr>
+          <w:rFonts w:ascii="Calibri" w:cs="Calibri" w:eastAsia="Calibri" w:hAnsi="Calibri"/>
+          <w:b w:val="0"/>
+          <w:bCs w:val="0"/>
+          <w:i w:val="0"/>
+          <w:iCs w:val="0"/>
+          <w:color w:val="1a1a2e"/>
+          <w:sz w:val="26"/>
+          <w:szCs w:val="26"/>
+          <w:rtl w:val="0"/>
+        </w:rPr>
       </w:r>
       <w:r>
         <w:rPr>
@@ -18679,91 +18674,85 @@
           <w:szCs w:val="26"/>
           <w:rtl w:val="0"/>
         </w:rPr>
-        <w:t xml:space="preserve">La oferta puede leerse en tres capas. </w:t>
-      </w:r>
-      <w:r>
-        <w:rPr>
-          <w:rFonts w:ascii="Calibri" w:cs="Calibri" w:eastAsia="Calibri" w:hAnsi="Calibri"/>
-          <w:b w:val="1"/>
-          <w:bCs w:val="1"/>
-          <w:i w:val="0"/>
-          <w:iCs w:val="0"/>
-          <w:color w:val="1a1a2e"/>
-          <w:sz w:val="26"/>
-          <w:szCs w:val="26"/>
-          <w:rtl w:val="0"/>
-        </w:rPr>
-        <w:t xml:space="preserve">Acceso inicial</w:t>
-      </w:r>
-      <w:r>
-        <w:rPr>
-          <w:rFonts w:ascii="Calibri" w:cs="Calibri" w:eastAsia="Calibri" w:hAnsi="Calibri"/>
-          <w:b w:val="0"/>
-          <w:bCs w:val="0"/>
-          <w:i w:val="0"/>
-          <w:iCs w:val="0"/>
-          <w:color w:val="1a1a2e"/>
-          <w:sz w:val="26"/>
-          <w:szCs w:val="26"/>
-          <w:rtl w:val="0"/>
-        </w:rPr>
-        <w:t xml:space="preserve">, donde entran la propuesta preliminar, la visualización y una referencia económica básica. </w:t>
-      </w:r>
-      <w:r>
-        <w:rPr>
-          <w:rFonts w:ascii="Calibri" w:cs="Calibri" w:eastAsia="Calibri" w:hAnsi="Calibri"/>
-          <w:b w:val="1"/>
-          <w:bCs w:val="1"/>
-          <w:i w:val="0"/>
-          <w:iCs w:val="0"/>
-          <w:color w:val="1a1a2e"/>
-          <w:sz w:val="26"/>
-          <w:szCs w:val="26"/>
-          <w:rtl w:val="0"/>
-        </w:rPr>
-        <w:t xml:space="preserve">Optimización</w:t>
-      </w:r>
-      <w:r>
-        <w:rPr>
-          <w:rFonts w:ascii="Calibri" w:cs="Calibri" w:eastAsia="Calibri" w:hAnsi="Calibri"/>
-          <w:b w:val="0"/>
-          <w:bCs w:val="0"/>
-          <w:i w:val="0"/>
-          <w:iCs w:val="0"/>
-          <w:color w:val="1a1a2e"/>
-          <w:sz w:val="26"/>
-          <w:szCs w:val="26"/>
-          <w:rtl w:val="0"/>
-        </w:rPr>
-        <w:t xml:space="preserve">, donde aparecen el cómputo más estructurado y el cruce con marketplace. </w:t>
-      </w:r>
-      <w:r>
-        <w:rPr>
-          <w:rFonts w:ascii="Calibri" w:cs="Calibri" w:eastAsia="Calibri" w:hAnsi="Calibri"/>
-          <w:b w:val="1"/>
-          <w:bCs w:val="1"/>
-          <w:i w:val="0"/>
-          <w:iCs w:val="0"/>
-          <w:color w:val="1a1a2e"/>
-          <w:sz w:val="26"/>
-          <w:szCs w:val="26"/>
-          <w:rtl w:val="0"/>
-        </w:rPr>
-        <w:t xml:space="preserve">Servicios ampliados</w:t>
-      </w:r>
-      <w:r>
-        <w:rPr>
-          <w:rFonts w:ascii="Calibri" w:cs="Calibri" w:eastAsia="Calibri" w:hAnsi="Calibri"/>
-          <w:b w:val="0"/>
-          <w:bCs w:val="0"/>
-          <w:i w:val="0"/>
-          <w:iCs w:val="0"/>
-          <w:color w:val="1a1a2e"/>
-          <w:sz w:val="26"/>
-          <w:szCs w:val="26"/>
-          <w:rtl w:val="0"/>
-        </w:rPr>
-        <w:t xml:space="preserve">, que abren la puerta a funcionalidades premium, integración con aliados o soporte profesional. Leída de esta manera, la cartera conserva orden y evita mezclar desde el comienzo promesas que pertenecen a momentos distintos del recorrido.</w:t>
+        <w:t>La oferta puede leerse en tres capas. Una capa de acceso inicial, gratuita o muy barata, donde entran la propuesta preliminar, la visualización y una referencia económica básica. Una capa premium de profundización, donde aparecen el cómputo descargable, el reporte ampliado y las variantes comparativas. Y una capa transaccional, donde el cruce con marketplace puede derivar en comisión por operación exitosa. Leída de esta manera, la cartera conserva orden y hace explícita la lógica de monetización del proyecto desde el recorrido del usuario.</w:t>
+      </w:r>
+      <w:r>
+        <w:rPr>
+          <w:rFonts w:ascii="Calibri" w:cs="Calibri" w:eastAsia="Calibri" w:hAnsi="Calibri"/>
+          <w:b w:val="1"/>
+          <w:bCs w:val="1"/>
+          <w:i w:val="0"/>
+          <w:iCs w:val="0"/>
+          <w:color w:val="1a1a2e"/>
+          <w:sz w:val="26"/>
+          <w:szCs w:val="26"/>
+          <w:rtl w:val="0"/>
+        </w:rPr>
+      </w:r>
+      <w:r>
+        <w:rPr>
+          <w:rFonts w:ascii="Calibri" w:cs="Calibri" w:eastAsia="Calibri" w:hAnsi="Calibri"/>
+          <w:b w:val="0"/>
+          <w:bCs w:val="0"/>
+          <w:i w:val="0"/>
+          <w:iCs w:val="0"/>
+          <w:color w:val="1a1a2e"/>
+          <w:sz w:val="26"/>
+          <w:szCs w:val="26"/>
+          <w:rtl w:val="0"/>
+        </w:rPr>
+      </w:r>
+      <w:r>
+        <w:rPr>
+          <w:rFonts w:ascii="Calibri" w:cs="Calibri" w:eastAsia="Calibri" w:hAnsi="Calibri"/>
+          <w:b w:val="1"/>
+          <w:bCs w:val="1"/>
+          <w:i w:val="0"/>
+          <w:iCs w:val="0"/>
+          <w:color w:val="1a1a2e"/>
+          <w:sz w:val="26"/>
+          <w:szCs w:val="26"/>
+          <w:rtl w:val="0"/>
+        </w:rPr>
+      </w:r>
+      <w:r>
+        <w:rPr>
+          <w:rFonts w:ascii="Calibri" w:cs="Calibri" w:eastAsia="Calibri" w:hAnsi="Calibri"/>
+          <w:b w:val="0"/>
+          <w:bCs w:val="0"/>
+          <w:i w:val="0"/>
+          <w:iCs w:val="0"/>
+          <w:color w:val="1a1a2e"/>
+          <w:sz w:val="26"/>
+          <w:szCs w:val="26"/>
+          <w:rtl w:val="0"/>
+        </w:rPr>
+      </w:r>
+      <w:r>
+        <w:rPr>
+          <w:rFonts w:ascii="Calibri" w:cs="Calibri" w:eastAsia="Calibri" w:hAnsi="Calibri"/>
+          <w:b w:val="1"/>
+          <w:bCs w:val="1"/>
+          <w:i w:val="0"/>
+          <w:iCs w:val="0"/>
+          <w:color w:val="1a1a2e"/>
+          <w:sz w:val="26"/>
+          <w:szCs w:val="26"/>
+          <w:rtl w:val="0"/>
+        </w:rPr>
+      </w:r>
+      <w:r>
+        <w:rPr>
+          <w:rFonts w:ascii="Calibri" w:cs="Calibri" w:eastAsia="Calibri" w:hAnsi="Calibri"/>
+          <w:b w:val="0"/>
+          <w:bCs w:val="0"/>
+          <w:i w:val="0"/>
+          <w:iCs w:val="0"/>
+          <w:color w:val="1a1a2e"/>
+          <w:sz w:val="26"/>
+          <w:szCs w:val="26"/>
+          <w:rtl w:val="0"/>
+        </w:rPr>
       </w:r>
       <w:r>
         <w:rPr>
@@ -19307,99 +19296,96 @@
           <w:szCs w:val="26"/>
           <w:rtl w:val="0"/>
         </w:rPr>
-        <w:t xml:space="preserve">Después</w:t>
-      </w:r>
-      <w:r>
-        <w:rPr>
-          <w:rFonts w:ascii="Calibri" w:cs="Calibri" w:eastAsia="Calibri" w:hAnsi="Calibri"/>
-          <w:b w:val="0"/>
-          <w:bCs w:val="0"/>
-          <w:i w:val="0"/>
-          <w:iCs w:val="0"/>
-          <w:color w:val="1a1a2e"/>
-          <w:sz w:val="26"/>
-          <w:szCs w:val="26"/>
-          <w:rtl w:val="0"/>
-        </w:rPr>
-        <w:t xml:space="preserve">, una monetización temprana del servicio principal, sin necesidad de cobrar el acceso inicial. Una hipótesis razonable sería mantener gratuita la primera experiencia orientativa y cobrar un plan premium cuando el usuario quiera descargar un cómputo más detallado, variantes comparativas o un reporte exportable. Como referencia preliminar, ese plan podría ubicarse en un rango equivalente a una consulta arquitectónica breve de mercado, por ejemplo entre ARS 25.000 y ARS 40.000 por proyecto, con un punto de entrada sugerido cercano a ARS 29.900 para la descarga del cómputo detallado en Excel y reporte ampliado.</w:t>
-      </w:r>
-      <w:r>
-        <w:rPr>
-          <w:rtl w:val="0"/>
-        </w:rPr>
-      </w:r>
-    </w:p>
-    <w:p>
-      <w:pPr>
-        <w:spacing w:after="200" w:before="0" w:line="240" w:lineRule="auto"/>
-        <w:rPr/>
-      </w:pPr>
-      <w:r>
-        <w:rPr>
-          <w:rFonts w:ascii="Calibri" w:cs="Calibri" w:eastAsia="Calibri" w:hAnsi="Calibri"/>
-          <w:b w:val="1"/>
-          <w:bCs w:val="1"/>
-          <w:i w:val="0"/>
-          <w:iCs w:val="0"/>
-          <w:color w:val="1a1a2e"/>
-          <w:sz w:val="26"/>
-          <w:szCs w:val="26"/>
-          <w:rtl w:val="0"/>
-        </w:rPr>
-        <w:t xml:space="preserve">En una tercera fase</w:t>
-      </w:r>
-      <w:r>
-        <w:rPr>
-          <w:rFonts w:ascii="Calibri" w:cs="Calibri" w:eastAsia="Calibri" w:hAnsi="Calibri"/>
-          <w:b w:val="0"/>
-          <w:bCs w:val="0"/>
-          <w:i w:val="0"/>
-          <w:iCs w:val="0"/>
-          <w:color w:val="1a1a2e"/>
-          <w:sz w:val="26"/>
-          <w:szCs w:val="26"/>
-          <w:rtl w:val="0"/>
-        </w:rPr>
-        <w:t xml:space="preserve">, si el marketplace empieza a mostrar movimiento real, la plataforma podría capturar valor mediante comisión por transacción, publicación destacada o servicios de visibilidad para oferentes. Como hipótesis inicial de pricing, una comisión del 8 % sobre la operación aparece como un punto intermedio razonable: suficientemente baja como para no desalentar la publicación de excedentes, pero suficientemente alta como para capturar valor por intermediación, confianza, visibilidad y matching contextualizado. Esta fase exige más madurez porque depende de confianza, volumen y calidad de coincidencias.</w:t>
-      </w:r>
-      <w:r>
-        <w:rPr>
-          <w:rtl w:val="0"/>
-        </w:rPr>
-      </w:r>
-    </w:p>
-    <w:p>
-      <w:pPr>
-        <w:spacing w:after="200" w:before="0" w:line="240" w:lineRule="auto"/>
-        <w:rPr/>
-      </w:pPr>
-      <w:r>
-        <w:rPr>
-          <w:rFonts w:ascii="Calibri" w:cs="Calibri" w:eastAsia="Calibri" w:hAnsi="Calibri"/>
-          <w:b w:val="1"/>
-          <w:bCs w:val="1"/>
-          <w:i w:val="0"/>
-          <w:iCs w:val="0"/>
-          <w:color w:val="1a1a2e"/>
-          <w:sz w:val="26"/>
-          <w:szCs w:val="26"/>
-          <w:rtl w:val="0"/>
-        </w:rPr>
-        <w:t xml:space="preserve">Más adelante</w:t>
-      </w:r>
-      <w:r>
-        <w:rPr>
-          <w:rFonts w:ascii="Calibri" w:cs="Calibri" w:eastAsia="Calibri" w:hAnsi="Calibri"/>
-          <w:b w:val="0"/>
-          <w:bCs w:val="0"/>
-          <w:i w:val="0"/>
-          <w:iCs w:val="0"/>
-          <w:color w:val="1a1a2e"/>
-          <w:sz w:val="26"/>
-          <w:szCs w:val="26"/>
-          <w:rtl w:val="0"/>
-        </w:rPr>
-        <w:t xml:space="preserve">, HabitatIA podría combinar ingresos provenientes de usuarios finales, actores del marketplace y acuerdos con aliados. Esa diversificación fortalecería la sustentabilidad del modelo.</w:t>
+        <w:t>Después, una monetización temprana del servicio principal, sin necesidad de cobrar el acceso inicial. La hipótesis definida es mantener gratuita, o muy barata, la primera experiencia orientativa y cobrar un plan premium cuando el usuario quiera descargar entregables concretos de mayor profundidad. Ese plan incluiría el cómputo detallado en Excel, un reporte ampliado y variantes comparativas básicas. Como referencia preliminar, podría ubicarse entre ARS 25.000 y ARS 40.000 por proyecto, con un punto de entrada sugerido cercano a ARS 29.900.</w:t>
+      </w:r>
+      <w:r>
+        <w:rPr>
+          <w:rFonts w:ascii="Calibri" w:cs="Calibri" w:eastAsia="Calibri" w:hAnsi="Calibri"/>
+          <w:b w:val="0"/>
+          <w:bCs w:val="0"/>
+          <w:i w:val="0"/>
+          <w:iCs w:val="0"/>
+          <w:color w:val="1a1a2e"/>
+          <w:sz w:val="26"/>
+          <w:szCs w:val="26"/>
+          <w:rtl w:val="0"/>
+        </w:rPr>
+      </w:r>
+      <w:r>
+        <w:rPr>
+          <w:rtl w:val="0"/>
+        </w:rPr>
+      </w:r>
+    </w:p>
+    <w:p>
+      <w:pPr>
+        <w:spacing w:after="200" w:before="0" w:line="240" w:lineRule="auto"/>
+        <w:rPr/>
+      </w:pPr>
+      <w:r>
+        <w:rPr>
+          <w:rFonts w:ascii="Calibri" w:cs="Calibri" w:eastAsia="Calibri" w:hAnsi="Calibri"/>
+          <w:b w:val="1"/>
+          <w:bCs w:val="1"/>
+          <w:i w:val="0"/>
+          <w:iCs w:val="0"/>
+          <w:color w:val="1a1a2e"/>
+          <w:sz w:val="26"/>
+          <w:szCs w:val="26"/>
+          <w:rtl w:val="0"/>
+        </w:rPr>
+        <w:t>En una tercera fase, si el marketplace empieza a mostrar movimiento real, la plataforma podría capturar valor mediante comisión por transacción, publicación destacada o servicios de visibilidad para oferentes. Como hipótesis inicial de pricing, se definió una comisión del 8 % sobre la operación como un punto intermedio razonable: no tan alta como para desalentar la publicación de excedentes, pero no tan baja como para volver débil la captura de valor por intermediación, confianza, visibilidad y matching contextualizado. Esta fase exige más madurez porque depende de confianza, volumen y calidad de coincidencias.</w:t>
+      </w:r>
+      <w:r>
+        <w:rPr>
+          <w:rFonts w:ascii="Calibri" w:cs="Calibri" w:eastAsia="Calibri" w:hAnsi="Calibri"/>
+          <w:b w:val="0"/>
+          <w:bCs w:val="0"/>
+          <w:i w:val="0"/>
+          <w:iCs w:val="0"/>
+          <w:color w:val="1a1a2e"/>
+          <w:sz w:val="26"/>
+          <w:szCs w:val="26"/>
+          <w:rtl w:val="0"/>
+        </w:rPr>
+      </w:r>
+      <w:r>
+        <w:rPr>
+          <w:rtl w:val="0"/>
+        </w:rPr>
+      </w:r>
+    </w:p>
+    <w:p>
+      <w:pPr>
+        <w:spacing w:after="200" w:before="0" w:line="240" w:lineRule="auto"/>
+        <w:rPr/>
+      </w:pPr>
+      <w:r>
+        <w:rPr>
+          <w:rFonts w:ascii="Calibri" w:cs="Calibri" w:eastAsia="Calibri" w:hAnsi="Calibri"/>
+          <w:b w:val="1"/>
+          <w:bCs w:val="1"/>
+          <w:i w:val="0"/>
+          <w:iCs w:val="0"/>
+          <w:color w:val="1a1a2e"/>
+          <w:sz w:val="26"/>
+          <w:szCs w:val="26"/>
+          <w:rtl w:val="0"/>
+        </w:rPr>
+        <w:t>Vista en conjunto, la lógica de monetización queda definida en tres capas: acceso inicial gratuito o de muy bajo costo para entrada, capa premium para profundidad y descarga de entregables, y comisión sobre transacción exitosa en marketplace cuando la plataforma efectivamente conecta oferta y demanda. Más adelante, HabitatIA podría además combinar ingresos provenientes de usuarios finales, actores del marketplace y acuerdos con aliados. Esa diversificación fortalecería la sustentabilidad del modelo.</w:t>
+      </w:r>
+      <w:r>
+        <w:rPr>
+          <w:rFonts w:ascii="Calibri" w:cs="Calibri" w:eastAsia="Calibri" w:hAnsi="Calibri"/>
+          <w:b w:val="0"/>
+          <w:bCs w:val="0"/>
+          <w:i w:val="0"/>
+          <w:iCs w:val="0"/>
+          <w:color w:val="1a1a2e"/>
+          <w:sz w:val="26"/>
+          <w:szCs w:val="26"/>
+          <w:rtl w:val="0"/>
+        </w:rPr>
       </w:r>
       <w:r>
         <w:rPr>
@@ -25412,7 +25398,7 @@
           <w:szCs w:val="26"/>
           <w:rtl w:val="0"/>
         </w:rPr>
-        <w:t xml:space="preserve">Avanzar sobre premium, comisiones, publicaciones destacadas o servicios complementarios según el segmento.</w:t>
+        <w:t>La monetización debería explicitarse desde el inicio con una lógica simple: entrada gratuita o de muy bajo costo para facilitar prueba, plan premium para quienes quieran descargar cómputo detallado en Excel, reporte ampliado y variantes comparativas básicas, y comisión del 8 % sobre operaciones exitosas del marketplace una vez exista suficiente tracción. A eso podrían sumarse más adelante publicaciones destacadas o servicios complementarios según el segmento.</w:t>
       </w:r>
       <w:r>
         <w:rPr>

</xml_diff>

<commit_message>
docs: specify HabitatIA competitive landscape
</commit_message>
<xml_diff>
--- a/Entregable N1 HabitatIA.docx
+++ b/Entregable N1 HabitatIA.docx
@@ -19796,23 +19796,7 @@
         <w:rPr/>
       </w:pPr>
       <w:r>
-        <w:rPr>
-          <w:rFonts w:ascii="Calibri" w:cs="Calibri" w:eastAsia="Calibri" w:hAnsi="Calibri"/>
-          <w:b w:val="0"/>
-          <w:bCs w:val="0"/>
-          <w:i w:val="0"/>
-          <w:iCs w:val="0"/>
-          <w:color w:val="1a1a2e"/>
-          <w:sz w:val="26"/>
-          <w:szCs w:val="26"/>
-          <w:rtl w:val="0"/>
-        </w:rPr>
-        <w:t xml:space="preserve">Uno de los errores frecuentes al analizar competencia en proyectos híbridos es buscar un único actor que haga exactamente lo mismo. En HabitatIA, ese enfoque sería pobre. Más profesional es entender el entorno competitivo como un ecosistema de soluciones parciales, sustitutos y actores con los que la plataforma compite y coopera al mismo tiempo. Este análisis es especialmente importante porque permite ubicar el proyecto en una intersección estratégica y detectar no solo amenazas, sino también vacíos del mercado.</w:t>
-      </w:r>
-      <w:r>
-        <w:rPr>
-          <w:rtl w:val="0"/>
-        </w:rPr>
+        <w:t>Uno de los errores frecuentes al analizar competencia en proyectos híbridos es buscar un único actor que haga exactamente lo mismo. En HabitatIA, ese enfoque sería pobre. Más profesional es entender el entorno competitivo como un ecosistema de soluciones parciales, sustitutos y actores con los que la plataforma compite y coopera al mismo tiempo. Este análisis es especialmente importante porque permite ubicar el proyecto en una intersección estratégica y detectar no solo amenazas, sino también vacíos del mercado. Cuando esa lectura se baja a jugadores reales, el panorama se vuelve más claro: HabitatIA no compite contra una sola empresa, sino contra categorías concretas como marketplaces generalistas de materiales, corralones digitales, software de diseño accesible y herramientas profesionales de arquitectura y BIM.</w:t>
       </w:r>
     </w:p>
     <w:p>
@@ -19848,48 +19832,16 @@
         <w:rPr/>
       </w:pPr>
       <w:r>
-        <w:rPr>
-          <w:rFonts w:ascii="Calibri" w:cs="Calibri" w:eastAsia="Calibri" w:hAnsi="Calibri"/>
-          <w:b w:val="1"/>
-          <w:bCs w:val="1"/>
-          <w:i w:val="0"/>
-          <w:iCs w:val="0"/>
-          <w:color w:val="2a7f8f"/>
-          <w:sz w:val="28"/>
-          <w:szCs w:val="28"/>
-          <w:rtl w:val="0"/>
-        </w:rPr>
-        <w:t xml:space="preserve">8.2.1 Estudios de arquitectura tradicionales</w:t>
-      </w:r>
-      <w:r>
-        <w:rPr>
-          <w:rtl w:val="0"/>
-        </w:rPr>
-      </w:r>
-    </w:p>
-    <w:p>
-      <w:pPr>
-        <w:spacing w:after="200" w:before="0" w:line="240" w:lineRule="auto"/>
-        <w:rPr/>
-      </w:pPr>
-      <w:r>
-        <w:rPr>
-          <w:rFonts w:ascii="Calibri" w:cs="Calibri" w:eastAsia="Calibri" w:hAnsi="Calibri"/>
-          <w:b w:val="0"/>
-          <w:bCs w:val="0"/>
-          <w:i w:val="0"/>
-          <w:iCs w:val="0"/>
-          <w:color w:val="1a1a2e"/>
-          <w:sz w:val="26"/>
-          <w:szCs w:val="26"/>
-          <w:rtl w:val="0"/>
-        </w:rPr>
-        <w:t xml:space="preserve">Resuelven personalización, criterio técnico y acompañamiento profesional. Su mayor fortaleza está en la profundidad del servicio. Su mayor limitación, en relación con HabitatIA, aparece en el costo de entrada, la velocidad y la menor capacidad de ofrecer una experiencia inmediata para la etapa exploratoria.</w:t>
-      </w:r>
-      <w:r>
-        <w:rPr>
-          <w:rtl w:val="0"/>
-        </w:rPr>
+        <w:t>8.2.1 Marketplaces generalistas de materiales y clasificados</w:t>
+      </w:r>
+    </w:p>
+    <w:p>
+      <w:pPr>
+        <w:spacing w:after="200" w:before="0" w:line="240" w:lineRule="auto"/>
+        <w:rPr/>
+      </w:pPr>
+      <w:r>
+        <w:t>Aquí aparece un competidor real y evidente como Mercado Libre, que ya tiene una categoría consolidada de construcción y materiales. Su fortaleza es la escala, la costumbre de uso, la infraestructura de pagos y envíos, y la enorme variedad de oferta. Su debilidad para el caso HabitatIA es que no organiza la compra desde la lógica del proyecto habitacional. El usuario encuentra productos o publicaciones, pero no una lectura integrada entre necesidades de obra, cantidades requeridas, visualización y oportunidad de ahorro contextualizada.</w:t>
       </w:r>
     </w:p>
     <w:p>
@@ -19899,48 +19851,16 @@
         <w:rPr/>
       </w:pPr>
       <w:r>
-        <w:rPr>
-          <w:rFonts w:ascii="Calibri" w:cs="Calibri" w:eastAsia="Calibri" w:hAnsi="Calibri"/>
-          <w:b w:val="1"/>
-          <w:bCs w:val="1"/>
-          <w:i w:val="0"/>
-          <w:iCs w:val="0"/>
-          <w:color w:val="2a7f8f"/>
-          <w:sz w:val="28"/>
-          <w:szCs w:val="28"/>
-          <w:rtl w:val="0"/>
-        </w:rPr>
-        <w:t xml:space="preserve">8.2.2 Plataformas de inspiración visual y renders</w:t>
-      </w:r>
-      <w:r>
-        <w:rPr>
-          <w:rtl w:val="0"/>
-        </w:rPr>
-      </w:r>
-    </w:p>
-    <w:p>
-      <w:pPr>
-        <w:spacing w:after="200" w:before="0" w:line="240" w:lineRule="auto"/>
-        <w:rPr/>
-      </w:pPr>
-      <w:r>
-        <w:rPr>
-          <w:rFonts w:ascii="Calibri" w:cs="Calibri" w:eastAsia="Calibri" w:hAnsi="Calibri"/>
-          <w:b w:val="0"/>
-          <w:bCs w:val="0"/>
-          <w:i w:val="0"/>
-          <w:iCs w:val="0"/>
-          <w:color w:val="1a1a2e"/>
-          <w:sz w:val="26"/>
-          <w:szCs w:val="26"/>
-          <w:rtl w:val="0"/>
-        </w:rPr>
-        <w:t xml:space="preserve">Son útiles para inspirar, imaginar o explorar estilos, pero suelen carecer de conexión con materiales, costos y lógica de proyecto. En ese sentido, pueden competir por la atención del usuario, pero no cubren la misma profundidad funcional.</w:t>
-      </w:r>
-      <w:r>
-        <w:rPr>
-          <w:rtl w:val="0"/>
-        </w:rPr>
+        <w:t>8.2.2 Corralones digitales y retail de construcción</w:t>
+      </w:r>
+    </w:p>
+    <w:p>
+      <w:pPr>
+        <w:spacing w:after="200" w:before="0" w:line="240" w:lineRule="auto"/>
+        <w:rPr/>
+      </w:pPr>
+      <w:r>
+        <w:t>En esta categoría entran jugadores como Easy y, a escala regional, formatos como Sodimac Constructor o Homecenter. Resuelven abastecimiento, marca, stock formal y una experiencia de compra más ordenada que los canales puramente informales. Su fortaleza está en la confianza comercial, la amplitud de catálogo y la capacidad de vender materiales nuevos con una operatoria más estructurada. Su límite, en relación con HabitatIA, es que no convierten la necesidad del usuario en un proyecto preliminar con lógica de personalización, ni conectan esa decisión con una capa de reutilización inteligente de sobrantes.</w:t>
       </w:r>
     </w:p>
     <w:p>
@@ -19950,48 +19870,16 @@
         <w:rPr/>
       </w:pPr>
       <w:r>
-        <w:rPr>
-          <w:rFonts w:ascii="Calibri" w:cs="Calibri" w:eastAsia="Calibri" w:hAnsi="Calibri"/>
-          <w:b w:val="1"/>
-          <w:bCs w:val="1"/>
-          <w:i w:val="0"/>
-          <w:iCs w:val="0"/>
-          <w:color w:val="2a7f8f"/>
-          <w:sz w:val="28"/>
-          <w:szCs w:val="28"/>
-          <w:rtl w:val="0"/>
-        </w:rPr>
-        <w:t xml:space="preserve">8.2.3 Marketplaces generales de materiales</w:t>
-      </w:r>
-      <w:r>
-        <w:rPr>
-          <w:rtl w:val="0"/>
-        </w:rPr>
-      </w:r>
-    </w:p>
-    <w:p>
-      <w:pPr>
-        <w:spacing w:after="200" w:before="0" w:line="240" w:lineRule="auto"/>
-        <w:rPr/>
-      </w:pPr>
-      <w:r>
-        <w:rPr>
-          <w:rFonts w:ascii="Calibri" w:cs="Calibri" w:eastAsia="Calibri" w:hAnsi="Calibri"/>
-          <w:b w:val="0"/>
-          <w:bCs w:val="0"/>
-          <w:i w:val="0"/>
-          <w:iCs w:val="0"/>
-          <w:color w:val="1a1a2e"/>
-          <w:sz w:val="26"/>
-          <w:szCs w:val="26"/>
-          <w:rtl w:val="0"/>
-        </w:rPr>
-        <w:t xml:space="preserve">Compiten por el lado transaccional del marketplace, pero no integran una demanda guiada por un proyecto habitacional específico. Esa falta de contexto debilita la experiencia comparada con la propuesta de HabitatIA.</w:t>
-      </w:r>
-      <w:r>
-        <w:rPr>
-          <w:rtl w:val="0"/>
-        </w:rPr>
+        <w:t>8.2.3 Software accesible de diseño y visualización</w:t>
+      </w:r>
+    </w:p>
+    <w:p>
+      <w:pPr>
+        <w:spacing w:after="200" w:before="0" w:line="240" w:lineRule="auto"/>
+        <w:rPr/>
+      </w:pPr>
+      <w:r>
+        <w:t>Acá aparecen referencias como Planner 5D, Floorplanner y Homestyler. Son competidores reales por el lado de la visualización, el plano y la experiencia de exploración autónoma. Su fortaleza es la facilidad de uso, la rapidez para producir vistas atractivas y la accesibilidad para usuarios no técnicos. Su debilidad, para este caso, es que normalmente no resuelven el tramo económico y operativo completo: no están pensados como motores de decisión habitacional con presupuesto preliminar conectado a materiales ni como marketplaces de excedentes de obra.</w:t>
       </w:r>
     </w:p>
     <w:p>
@@ -20001,48 +19889,16 @@
         <w:rPr/>
       </w:pPr>
       <w:r>
-        <w:rPr>
-          <w:rFonts w:ascii="Calibri" w:cs="Calibri" w:eastAsia="Calibri" w:hAnsi="Calibri"/>
-          <w:b w:val="1"/>
-          <w:bCs w:val="1"/>
-          <w:i w:val="0"/>
-          <w:iCs w:val="0"/>
-          <w:color w:val="2a7f8f"/>
-          <w:sz w:val="28"/>
-          <w:szCs w:val="28"/>
-          <w:rtl w:val="0"/>
-        </w:rPr>
-        <w:t xml:space="preserve">8.2.4 Soluciones modulares o constructoras especializadas</w:t>
-      </w:r>
-      <w:r>
-        <w:rPr>
-          <w:rtl w:val="0"/>
-        </w:rPr>
-      </w:r>
-    </w:p>
-    <w:p>
-      <w:pPr>
-        <w:spacing w:after="200" w:before="0" w:line="240" w:lineRule="auto"/>
-        <w:rPr/>
-      </w:pPr>
-      <w:r>
-        <w:rPr>
-          <w:rFonts w:ascii="Calibri" w:cs="Calibri" w:eastAsia="Calibri" w:hAnsi="Calibri"/>
-          <w:b w:val="0"/>
-          <w:bCs w:val="0"/>
-          <w:i w:val="0"/>
-          <w:iCs w:val="0"/>
-          <w:color w:val="1a1a2e"/>
-          <w:sz w:val="26"/>
-          <w:szCs w:val="26"/>
-          <w:rtl w:val="0"/>
-        </w:rPr>
-        <w:t xml:space="preserve">Pueden captar usuarios que buscan rapidez y estandarización. Su debilidad relativa puede estar en la menor personalización y en la falta de integración con una lógica de ahorro por reutilización.</w:t>
-      </w:r>
-      <w:r>
-        <w:rPr>
-          <w:rtl w:val="0"/>
-        </w:rPr>
+        <w:t>8.2.4 Software profesional de arquitectura y BIM</w:t>
+      </w:r>
+    </w:p>
+    <w:p>
+      <w:pPr>
+        <w:spacing w:after="200" w:before="0" w:line="240" w:lineRule="auto"/>
+        <w:rPr/>
+      </w:pPr>
+      <w:r>
+        <w:t>En una capa distinta aparecen herramientas como Revit dentro del ecosistema Autodesk AEC y SketchUp. No compiten exactamente desde la misma propuesta de entrada, pero sí representan sustitutos parciales o referencias de legitimidad técnica. Su fortaleza es el rigor profesional, la profundidad de modelado y la documentación. Su limitación relativa para el segmento inicial de HabitatIA es que exigen más conocimiento, más tiempo y, muchas veces, intermediación profesional. Son soluciones potentes, pero menos accesibles para el usuario que todavía está tratando de ordenar una decisión preliminar.</w:t>
       </w:r>
     </w:p>
     <w:p>
@@ -20052,48 +19908,16 @@
         <w:rPr/>
       </w:pPr>
       <w:r>
-        <w:rPr>
-          <w:rFonts w:ascii="Calibri" w:cs="Calibri" w:eastAsia="Calibri" w:hAnsi="Calibri"/>
-          <w:b w:val="1"/>
-          <w:bCs w:val="1"/>
-          <w:i w:val="0"/>
-          <w:iCs w:val="0"/>
-          <w:color w:val="2a7f8f"/>
-          <w:sz w:val="28"/>
-          <w:szCs w:val="28"/>
-          <w:rtl w:val="0"/>
-        </w:rPr>
-        <w:t xml:space="preserve">8.2.5 Herramientas de presupuesto o cálculo aislado</w:t>
-      </w:r>
-      <w:r>
-        <w:rPr>
-          <w:rtl w:val="0"/>
-        </w:rPr>
-      </w:r>
-    </w:p>
-    <w:p>
-      <w:pPr>
-        <w:spacing w:after="200" w:before="0" w:line="240" w:lineRule="auto"/>
-        <w:rPr/>
-      </w:pPr>
-      <w:r>
-        <w:rPr>
-          <w:rFonts w:ascii="Calibri" w:cs="Calibri" w:eastAsia="Calibri" w:hAnsi="Calibri"/>
-          <w:b w:val="0"/>
-          <w:bCs w:val="0"/>
-          <w:i w:val="0"/>
-          <w:iCs w:val="0"/>
-          <w:color w:val="1a1a2e"/>
-          <w:sz w:val="26"/>
-          <w:szCs w:val="26"/>
-          <w:rtl w:val="0"/>
-        </w:rPr>
-        <w:t xml:space="preserve">En algunos casos, pueden resolver una parte del problema económico, pero no acompañan con la misma potencia visual ni con la integración del marketplace.</w:t>
-      </w:r>
-      <w:r>
-        <w:rPr>
-          <w:rtl w:val="0"/>
-        </w:rPr>
+        <w:t>8.2.5 Estudios tradicionales, constructoras y soluciones cerradas</w:t>
+      </w:r>
+    </w:p>
+    <w:p>
+      <w:pPr>
+        <w:spacing w:after="200" w:before="0" w:line="240" w:lineRule="auto"/>
+        <w:rPr/>
+      </w:pPr>
+      <w:r>
+        <w:t>Resuelven personalización, criterio técnico y acompañamiento profesional, o bien rapidez mediante propuestas más estandarizadas. Su fortaleza está en la profundidad del servicio o en la ejecución cerrada. Su mayor limitación, en relación con HabitatIA, aparece en el costo de entrada, la velocidad de exploración y la menor capacidad de ofrecer una experiencia inmediata y comparativa para la etapa exploratoria.</w:t>
       </w:r>
     </w:p>
     <w:p>
@@ -20128,51 +19952,7 @@
         <w:rPr/>
       </w:pPr>
       <w:r>
-        <w:rPr>
-          <w:rFonts w:ascii="Calibri" w:cs="Calibri" w:eastAsia="Calibri" w:hAnsi="Calibri"/>
-          <w:b w:val="0"/>
-          <w:bCs w:val="0"/>
-          <w:i w:val="0"/>
-          <w:iCs w:val="0"/>
-          <w:color w:val="1a1a2e"/>
-          <w:sz w:val="26"/>
-          <w:szCs w:val="26"/>
-          <w:rtl w:val="0"/>
-        </w:rPr>
-        <w:t xml:space="preserve">Para analizar el posicionamiento de HabitatIA conviene mirar algunas variables concretas: </w:t>
-      </w:r>
-      <w:r>
-        <w:rPr>
-          <w:rFonts w:ascii="Calibri" w:cs="Calibri" w:eastAsia="Calibri" w:hAnsi="Calibri"/>
-          <w:b w:val="1"/>
-          <w:bCs w:val="1"/>
-          <w:i w:val="0"/>
-          <w:iCs w:val="0"/>
-          <w:color w:val="1a1a2e"/>
-          <w:sz w:val="26"/>
-          <w:szCs w:val="26"/>
-          <w:rtl w:val="0"/>
-        </w:rPr>
-        <w:t xml:space="preserve">grado de personalización, accesibilidad económica de entrada, claridad presupuestaria, experiencia digital integrada, capacidad de generar ahorro aplicable, incorporación de sostenibilidad y facilidad de uso para no especialistas</w:t>
-      </w:r>
-      <w:r>
-        <w:rPr>
-          <w:rFonts w:ascii="Calibri" w:cs="Calibri" w:eastAsia="Calibri" w:hAnsi="Calibri"/>
-          <w:b w:val="0"/>
-          <w:bCs w:val="0"/>
-          <w:i w:val="0"/>
-          <w:iCs w:val="0"/>
-          <w:color w:val="1a1a2e"/>
-          <w:sz w:val="26"/>
-          <w:szCs w:val="26"/>
-          <w:rtl w:val="0"/>
-        </w:rPr>
-        <w:t xml:space="preserve">. Esa combinación permite comparar no solo funcionalidades, sino también calidad de experiencia y pertinencia real para el usuario.</w:t>
-      </w:r>
-      <w:r>
-        <w:rPr>
-          <w:rtl w:val="0"/>
-        </w:rPr>
+        <w:t>Para analizar el posicionamiento de HabitatIA conviene mirar algunas variables concretas: grado de personalización, accesibilidad económica de entrada, claridad presupuestaria, experiencia digital integrada, capacidad de contextualizar materiales según proyecto, generación de ahorro aplicable, incorporación de sostenibilidad y facilidad de uso para no especialistas. Esa combinación permite comparar no solo funcionalidades, sino también calidad de experiencia y pertinencia real para el usuario.</w:t>
       </w:r>
     </w:p>
     <w:p>
@@ -20207,51 +19987,7 @@
         <w:rPr/>
       </w:pPr>
       <w:r>
-        <w:rPr>
-          <w:rFonts w:ascii="Calibri" w:cs="Calibri" w:eastAsia="Calibri" w:hAnsi="Calibri"/>
-          <w:b w:val="0"/>
-          <w:bCs w:val="0"/>
-          <w:i w:val="0"/>
-          <w:iCs w:val="0"/>
-          <w:color w:val="1a1a2e"/>
-          <w:sz w:val="26"/>
-          <w:szCs w:val="26"/>
-          <w:rtl w:val="0"/>
-        </w:rPr>
-        <w:t xml:space="preserve">Una forma clara de ubicar a HabitatIA dentro del entorno competitivo es cruzar los principales tipos de competidor con cuatro atributos centrales: </w:t>
-      </w:r>
-      <w:r>
-        <w:rPr>
-          <w:rFonts w:ascii="Calibri" w:cs="Calibri" w:eastAsia="Calibri" w:hAnsi="Calibri"/>
-          <w:b w:val="1"/>
-          <w:bCs w:val="1"/>
-          <w:i w:val="0"/>
-          <w:iCs w:val="0"/>
-          <w:color w:val="1a1a2e"/>
-          <w:sz w:val="26"/>
-          <w:szCs w:val="26"/>
-          <w:rtl w:val="0"/>
-        </w:rPr>
-        <w:t xml:space="preserve">accesibilidad, personalización, criterio económico y circularidad</w:t>
-      </w:r>
-      <w:r>
-        <w:rPr>
-          <w:rFonts w:ascii="Calibri" w:cs="Calibri" w:eastAsia="Calibri" w:hAnsi="Calibri"/>
-          <w:b w:val="0"/>
-          <w:bCs w:val="0"/>
-          <w:i w:val="0"/>
-          <w:iCs w:val="0"/>
-          <w:color w:val="1a1a2e"/>
-          <w:sz w:val="26"/>
-          <w:szCs w:val="26"/>
-          <w:rtl w:val="0"/>
-        </w:rPr>
-        <w:t xml:space="preserve">.</w:t>
-      </w:r>
-      <w:r>
-        <w:rPr>
-          <w:rtl w:val="0"/>
-        </w:rPr>
+        <w:t>Una forma más precisa de ubicar a HabitatIA dentro del entorno competitivo es cruzar categorías reales con cinco atributos centrales: accesibilidad, personalización, criterio económico, contextualización por proyecto y circularidad.</w:t>
       </w:r>
     </w:p>
     <w:tbl>
@@ -20302,28 +20038,8 @@
             </w:tcMar>
           </w:tcPr>
           <w:p>
-            <w:pPr>
-              <w:spacing w:after="60" w:before="60" w:line="240" w:lineRule="auto"/>
-              <w:rPr/>
-            </w:pPr>
             <w:r>
-              <w:rPr>
-                <w:rFonts w:ascii="Calibri" w:cs="Calibri" w:eastAsia="Calibri" w:hAnsi="Calibri"/>
-                <w:b w:val="1"/>
-                <w:bCs w:val="1"/>
-                <w:i w:val="0"/>
-                <w:iCs w:val="0"/>
-                <w:color w:val="ffffff"/>
-                <w:sz w:val="22"/>
-                <w:szCs w:val="22"/>
-                <w:rtl w:val="0"/>
-              </w:rPr>
-              <w:t xml:space="preserve">Actor / atributo</w:t>
-            </w:r>
-            <w:r>
-              <w:rPr>
-                <w:rtl w:val="0"/>
-              </w:rPr>
+              <w:t>Actor / categoría</w:t>
             </w:r>
           </w:p>
         </w:tc>
@@ -20338,28 +20054,8 @@
             </w:tcMar>
           </w:tcPr>
           <w:p>
-            <w:pPr>
-              <w:spacing w:after="60" w:before="60" w:line="240" w:lineRule="auto"/>
-              <w:rPr/>
-            </w:pPr>
             <w:r>
-              <w:rPr>
-                <w:rFonts w:ascii="Calibri" w:cs="Calibri" w:eastAsia="Calibri" w:hAnsi="Calibri"/>
-                <w:b w:val="1"/>
-                <w:bCs w:val="1"/>
-                <w:i w:val="0"/>
-                <w:iCs w:val="0"/>
-                <w:color w:val="ffffff"/>
-                <w:sz w:val="22"/>
-                <w:szCs w:val="22"/>
-                <w:rtl w:val="0"/>
-              </w:rPr>
-              <w:t xml:space="preserve">Accesibilidad</w:t>
-            </w:r>
-            <w:r>
-              <w:rPr>
-                <w:rtl w:val="0"/>
-              </w:rPr>
+              <w:t>Accesibilidad</w:t>
             </w:r>
           </w:p>
         </w:tc>
@@ -20374,28 +20070,8 @@
             </w:tcMar>
           </w:tcPr>
           <w:p>
-            <w:pPr>
-              <w:spacing w:after="60" w:before="60" w:line="240" w:lineRule="auto"/>
-              <w:rPr/>
-            </w:pPr>
             <w:r>
-              <w:rPr>
-                <w:rFonts w:ascii="Calibri" w:cs="Calibri" w:eastAsia="Calibri" w:hAnsi="Calibri"/>
-                <w:b w:val="1"/>
-                <w:bCs w:val="1"/>
-                <w:i w:val="0"/>
-                <w:iCs w:val="0"/>
-                <w:color w:val="ffffff"/>
-                <w:sz w:val="22"/>
-                <w:szCs w:val="22"/>
-                <w:rtl w:val="0"/>
-              </w:rPr>
-              <w:t xml:space="preserve">Personalización</w:t>
-            </w:r>
-            <w:r>
-              <w:rPr>
-                <w:rtl w:val="0"/>
-              </w:rPr>
+              <w:t>Personalización</w:t>
             </w:r>
           </w:p>
         </w:tc>
@@ -20410,28 +20086,8 @@
             </w:tcMar>
           </w:tcPr>
           <w:p>
-            <w:pPr>
-              <w:spacing w:after="60" w:before="60" w:line="240" w:lineRule="auto"/>
-              <w:rPr/>
-            </w:pPr>
             <w:r>
-              <w:rPr>
-                <w:rFonts w:ascii="Calibri" w:cs="Calibri" w:eastAsia="Calibri" w:hAnsi="Calibri"/>
-                <w:b w:val="1"/>
-                <w:bCs w:val="1"/>
-                <w:i w:val="0"/>
-                <w:iCs w:val="0"/>
-                <w:color w:val="ffffff"/>
-                <w:sz w:val="22"/>
-                <w:szCs w:val="22"/>
-                <w:rtl w:val="0"/>
-              </w:rPr>
-              <w:t xml:space="preserve">Criterio económico</w:t>
-            </w:r>
-            <w:r>
-              <w:rPr>
-                <w:rtl w:val="0"/>
-              </w:rPr>
+              <w:t>Criterio económico + contexto</w:t>
             </w:r>
           </w:p>
         </w:tc>
@@ -20446,28 +20102,8 @@
             </w:tcMar>
           </w:tcPr>
           <w:p>
-            <w:pPr>
-              <w:spacing w:after="60" w:before="60" w:line="240" w:lineRule="auto"/>
-              <w:rPr/>
-            </w:pPr>
             <w:r>
-              <w:rPr>
-                <w:rFonts w:ascii="Calibri" w:cs="Calibri" w:eastAsia="Calibri" w:hAnsi="Calibri"/>
-                <w:b w:val="1"/>
-                <w:bCs w:val="1"/>
-                <w:i w:val="0"/>
-                <w:iCs w:val="0"/>
-                <w:color w:val="ffffff"/>
-                <w:sz w:val="22"/>
-                <w:szCs w:val="22"/>
-                <w:rtl w:val="0"/>
-              </w:rPr>
-              <w:t xml:space="preserve">Circularidad</w:t>
-            </w:r>
-            <w:r>
-              <w:rPr>
-                <w:rtl w:val="0"/>
-              </w:rPr>
+              <w:t>Circularidad</w:t>
             </w:r>
           </w:p>
         </w:tc>
@@ -20488,28 +20124,8 @@
             </w:tcMar>
           </w:tcPr>
           <w:p>
-            <w:pPr>
-              <w:spacing w:after="60" w:before="60" w:line="240" w:lineRule="auto"/>
-              <w:rPr/>
-            </w:pPr>
             <w:r>
-              <w:rPr>
-                <w:rFonts w:ascii="Calibri" w:cs="Calibri" w:eastAsia="Calibri" w:hAnsi="Calibri"/>
-                <w:b w:val="0"/>
-                <w:bCs w:val="0"/>
-                <w:i w:val="0"/>
-                <w:iCs w:val="0"/>
-                <w:color w:val="1a1a2e"/>
-                <w:sz w:val="22"/>
-                <w:szCs w:val="22"/>
-                <w:rtl w:val="0"/>
-              </w:rPr>
-              <w:t xml:space="preserve">HabitatIA</w:t>
-            </w:r>
-            <w:r>
-              <w:rPr>
-                <w:rtl w:val="0"/>
-              </w:rPr>
+              <w:t>HabitatIA</w:t>
             </w:r>
           </w:p>
         </w:tc>
@@ -20524,28 +20140,8 @@
             </w:tcMar>
           </w:tcPr>
           <w:p>
-            <w:pPr>
-              <w:spacing w:after="60" w:before="60" w:line="240" w:lineRule="auto"/>
-              <w:rPr/>
-            </w:pPr>
             <w:r>
-              <w:rPr>
-                <w:rFonts w:ascii="Calibri" w:cs="Calibri" w:eastAsia="Calibri" w:hAnsi="Calibri"/>
-                <w:b w:val="0"/>
-                <w:bCs w:val="0"/>
-                <w:i w:val="0"/>
-                <w:iCs w:val="0"/>
-                <w:color w:val="1a1a2e"/>
-                <w:sz w:val="22"/>
-                <w:szCs w:val="22"/>
-                <w:rtl w:val="0"/>
-              </w:rPr>
-              <w:t xml:space="preserve">Alta</w:t>
-            </w:r>
-            <w:r>
-              <w:rPr>
-                <w:rtl w:val="0"/>
-              </w:rPr>
+              <w:t>Alta</w:t>
             </w:r>
           </w:p>
         </w:tc>
@@ -20560,28 +20156,8 @@
             </w:tcMar>
           </w:tcPr>
           <w:p>
-            <w:pPr>
-              <w:spacing w:after="60" w:before="60" w:line="240" w:lineRule="auto"/>
-              <w:rPr/>
-            </w:pPr>
             <w:r>
-              <w:rPr>
-                <w:rFonts w:ascii="Calibri" w:cs="Calibri" w:eastAsia="Calibri" w:hAnsi="Calibri"/>
-                <w:b w:val="0"/>
-                <w:bCs w:val="0"/>
-                <w:i w:val="0"/>
-                <w:iCs w:val="0"/>
-                <w:color w:val="1a1a2e"/>
-                <w:sz w:val="22"/>
-                <w:szCs w:val="22"/>
-                <w:rtl w:val="0"/>
-              </w:rPr>
-              <w:t xml:space="preserve">Alta</w:t>
-            </w:r>
-            <w:r>
-              <w:rPr>
-                <w:rtl w:val="0"/>
-              </w:rPr>
+              <w:t>Alta</w:t>
             </w:r>
           </w:p>
         </w:tc>
@@ -20596,28 +20172,8 @@
             </w:tcMar>
           </w:tcPr>
           <w:p>
-            <w:pPr>
-              <w:spacing w:after="60" w:before="60" w:line="240" w:lineRule="auto"/>
-              <w:rPr/>
-            </w:pPr>
             <w:r>
-              <w:rPr>
-                <w:rFonts w:ascii="Calibri" w:cs="Calibri" w:eastAsia="Calibri" w:hAnsi="Calibri"/>
-                <w:b w:val="0"/>
-                <w:bCs w:val="0"/>
-                <w:i w:val="0"/>
-                <w:iCs w:val="0"/>
-                <w:color w:val="1a1a2e"/>
-                <w:sz w:val="22"/>
-                <w:szCs w:val="22"/>
-                <w:rtl w:val="0"/>
-              </w:rPr>
-              <w:t xml:space="preserve">Alta</w:t>
-            </w:r>
-            <w:r>
-              <w:rPr>
-                <w:rtl w:val="0"/>
-              </w:rPr>
+              <w:t>Alta</w:t>
             </w:r>
           </w:p>
         </w:tc>
@@ -20632,28 +20188,8 @@
             </w:tcMar>
           </w:tcPr>
           <w:p>
-            <w:pPr>
-              <w:spacing w:after="60" w:before="60" w:line="240" w:lineRule="auto"/>
-              <w:rPr/>
-            </w:pPr>
             <w:r>
-              <w:rPr>
-                <w:rFonts w:ascii="Calibri" w:cs="Calibri" w:eastAsia="Calibri" w:hAnsi="Calibri"/>
-                <w:b w:val="0"/>
-                <w:bCs w:val="0"/>
-                <w:i w:val="0"/>
-                <w:iCs w:val="0"/>
-                <w:color w:val="1a1a2e"/>
-                <w:sz w:val="22"/>
-                <w:szCs w:val="22"/>
-                <w:rtl w:val="0"/>
-              </w:rPr>
-              <w:t xml:space="preserve">Alta</w:t>
-            </w:r>
-            <w:r>
-              <w:rPr>
-                <w:rtl w:val="0"/>
-              </w:rPr>
+              <w:t>Alta</w:t>
             </w:r>
           </w:p>
         </w:tc>
@@ -20674,28 +20210,8 @@
             </w:tcMar>
           </w:tcPr>
           <w:p>
-            <w:pPr>
-              <w:spacing w:after="60" w:before="60" w:line="240" w:lineRule="auto"/>
-              <w:rPr/>
-            </w:pPr>
             <w:r>
-              <w:rPr>
-                <w:rFonts w:ascii="Calibri" w:cs="Calibri" w:eastAsia="Calibri" w:hAnsi="Calibri"/>
-                <w:b w:val="0"/>
-                <w:bCs w:val="0"/>
-                <w:i w:val="0"/>
-                <w:iCs w:val="0"/>
-                <w:color w:val="1a1a2e"/>
-                <w:sz w:val="22"/>
-                <w:szCs w:val="22"/>
-                <w:rtl w:val="0"/>
-              </w:rPr>
-              <w:t xml:space="preserve">Estudios tradicionales</w:t>
-            </w:r>
-            <w:r>
-              <w:rPr>
-                <w:rtl w:val="0"/>
-              </w:rPr>
+              <w:t>Mercado Libre / marketplaces generalistas</w:t>
             </w:r>
           </w:p>
         </w:tc>
@@ -20710,28 +20226,8 @@
             </w:tcMar>
           </w:tcPr>
           <w:p>
-            <w:pPr>
-              <w:spacing w:after="60" w:before="60" w:line="240" w:lineRule="auto"/>
-              <w:rPr/>
-            </w:pPr>
             <w:r>
-              <w:rPr>
-                <w:rFonts w:ascii="Calibri" w:cs="Calibri" w:eastAsia="Calibri" w:hAnsi="Calibri"/>
-                <w:b w:val="0"/>
-                <w:bCs w:val="0"/>
-                <w:i w:val="0"/>
-                <w:iCs w:val="0"/>
-                <w:color w:val="1a1a2e"/>
-                <w:sz w:val="22"/>
-                <w:szCs w:val="22"/>
-                <w:rtl w:val="0"/>
-              </w:rPr>
-              <w:t xml:space="preserve">Baja</w:t>
-            </w:r>
-            <w:r>
-              <w:rPr>
-                <w:rtl w:val="0"/>
-              </w:rPr>
+              <w:t>Alta</w:t>
             </w:r>
           </w:p>
         </w:tc>
@@ -20746,28 +20242,8 @@
             </w:tcMar>
           </w:tcPr>
           <w:p>
-            <w:pPr>
-              <w:spacing w:after="60" w:before="60" w:line="240" w:lineRule="auto"/>
-              <w:rPr/>
-            </w:pPr>
             <w:r>
-              <w:rPr>
-                <w:rFonts w:ascii="Calibri" w:cs="Calibri" w:eastAsia="Calibri" w:hAnsi="Calibri"/>
-                <w:b w:val="0"/>
-                <w:bCs w:val="0"/>
-                <w:i w:val="0"/>
-                <w:iCs w:val="0"/>
-                <w:color w:val="1a1a2e"/>
-                <w:sz w:val="22"/>
-                <w:szCs w:val="22"/>
-                <w:rtl w:val="0"/>
-              </w:rPr>
-              <w:t xml:space="preserve">Alta</w:t>
-            </w:r>
-            <w:r>
-              <w:rPr>
-                <w:rtl w:val="0"/>
-              </w:rPr>
+              <w:t>Baja</w:t>
             </w:r>
           </w:p>
         </w:tc>
@@ -20782,28 +20258,8 @@
             </w:tcMar>
           </w:tcPr>
           <w:p>
-            <w:pPr>
-              <w:spacing w:after="60" w:before="60" w:line="240" w:lineRule="auto"/>
-              <w:rPr/>
-            </w:pPr>
             <w:r>
-              <w:rPr>
-                <w:rFonts w:ascii="Calibri" w:cs="Calibri" w:eastAsia="Calibri" w:hAnsi="Calibri"/>
-                <w:b w:val="0"/>
-                <w:bCs w:val="0"/>
-                <w:i w:val="0"/>
-                <w:iCs w:val="0"/>
-                <w:color w:val="1a1a2e"/>
-                <w:sz w:val="22"/>
-                <w:szCs w:val="22"/>
-                <w:rtl w:val="0"/>
-              </w:rPr>
-              <w:t xml:space="preserve">Media</w:t>
-            </w:r>
-            <w:r>
-              <w:rPr>
-                <w:rtl w:val="0"/>
-              </w:rPr>
+              <w:t>Baja-media</w:t>
             </w:r>
           </w:p>
         </w:tc>
@@ -20818,28 +20274,8 @@
             </w:tcMar>
           </w:tcPr>
           <w:p>
-            <w:pPr>
-              <w:spacing w:after="60" w:before="60" w:line="240" w:lineRule="auto"/>
-              <w:rPr/>
-            </w:pPr>
             <w:r>
-              <w:rPr>
-                <w:rFonts w:ascii="Calibri" w:cs="Calibri" w:eastAsia="Calibri" w:hAnsi="Calibri"/>
-                <w:b w:val="0"/>
-                <w:bCs w:val="0"/>
-                <w:i w:val="0"/>
-                <w:iCs w:val="0"/>
-                <w:color w:val="1a1a2e"/>
-                <w:sz w:val="22"/>
-                <w:szCs w:val="22"/>
-                <w:rtl w:val="0"/>
-              </w:rPr>
-              <w:t xml:space="preserve">Baja</w:t>
-            </w:r>
-            <w:r>
-              <w:rPr>
-                <w:rtl w:val="0"/>
-              </w:rPr>
+              <w:t>Media</w:t>
             </w:r>
           </w:p>
         </w:tc>
@@ -20860,28 +20296,8 @@
             </w:tcMar>
           </w:tcPr>
           <w:p>
-            <w:pPr>
-              <w:spacing w:after="60" w:before="60" w:line="240" w:lineRule="auto"/>
-              <w:rPr/>
-            </w:pPr>
             <w:r>
-              <w:rPr>
-                <w:rFonts w:ascii="Calibri" w:cs="Calibri" w:eastAsia="Calibri" w:hAnsi="Calibri"/>
-                <w:b w:val="0"/>
-                <w:bCs w:val="0"/>
-                <w:i w:val="0"/>
-                <w:iCs w:val="0"/>
-                <w:color w:val="1a1a2e"/>
-                <w:sz w:val="22"/>
-                <w:szCs w:val="22"/>
-                <w:rtl w:val="0"/>
-              </w:rPr>
-              <w:t xml:space="preserve">Apps de renders / inspiración</w:t>
-            </w:r>
-            <w:r>
-              <w:rPr>
-                <w:rtl w:val="0"/>
-              </w:rPr>
+              <w:t>Easy / corralones digitales</w:t>
             </w:r>
           </w:p>
         </w:tc>
@@ -20896,28 +20312,8 @@
             </w:tcMar>
           </w:tcPr>
           <w:p>
-            <w:pPr>
-              <w:spacing w:after="60" w:before="60" w:line="240" w:lineRule="auto"/>
-              <w:rPr/>
-            </w:pPr>
             <w:r>
-              <w:rPr>
-                <w:rFonts w:ascii="Calibri" w:cs="Calibri" w:eastAsia="Calibri" w:hAnsi="Calibri"/>
-                <w:b w:val="0"/>
-                <w:bCs w:val="0"/>
-                <w:i w:val="0"/>
-                <w:iCs w:val="0"/>
-                <w:color w:val="1a1a2e"/>
-                <w:sz w:val="22"/>
-                <w:szCs w:val="22"/>
-                <w:rtl w:val="0"/>
-              </w:rPr>
-              <w:t xml:space="preserve">Alta</w:t>
-            </w:r>
-            <w:r>
-              <w:rPr>
-                <w:rtl w:val="0"/>
-              </w:rPr>
+              <w:t>Media</w:t>
             </w:r>
           </w:p>
         </w:tc>
@@ -20932,28 +20328,8 @@
             </w:tcMar>
           </w:tcPr>
           <w:p>
-            <w:pPr>
-              <w:spacing w:after="60" w:before="60" w:line="240" w:lineRule="auto"/>
-              <w:rPr/>
-            </w:pPr>
             <w:r>
-              <w:rPr>
-                <w:rFonts w:ascii="Calibri" w:cs="Calibri" w:eastAsia="Calibri" w:hAnsi="Calibri"/>
-                <w:b w:val="0"/>
-                <w:bCs w:val="0"/>
-                <w:i w:val="0"/>
-                <w:iCs w:val="0"/>
-                <w:color w:val="1a1a2e"/>
-                <w:sz w:val="22"/>
-                <w:szCs w:val="22"/>
-                <w:rtl w:val="0"/>
-              </w:rPr>
-              <w:t xml:space="preserve">Media</w:t>
-            </w:r>
-            <w:r>
-              <w:rPr>
-                <w:rtl w:val="0"/>
-              </w:rPr>
+              <w:t>Baja</w:t>
             </w:r>
           </w:p>
         </w:tc>
@@ -20968,28 +20344,8 @@
             </w:tcMar>
           </w:tcPr>
           <w:p>
-            <w:pPr>
-              <w:spacing w:after="60" w:before="60" w:line="240" w:lineRule="auto"/>
-              <w:rPr/>
-            </w:pPr>
             <w:r>
-              <w:rPr>
-                <w:rFonts w:ascii="Calibri" w:cs="Calibri" w:eastAsia="Calibri" w:hAnsi="Calibri"/>
-                <w:b w:val="0"/>
-                <w:bCs w:val="0"/>
-                <w:i w:val="0"/>
-                <w:iCs w:val="0"/>
-                <w:color w:val="1a1a2e"/>
-                <w:sz w:val="22"/>
-                <w:szCs w:val="22"/>
-                <w:rtl w:val="0"/>
-              </w:rPr>
-              <w:t xml:space="preserve">Baja</w:t>
-            </w:r>
-            <w:r>
-              <w:rPr>
-                <w:rtl w:val="0"/>
-              </w:rPr>
+              <w:t>Baja-media</w:t>
             </w:r>
           </w:p>
         </w:tc>
@@ -21004,28 +20360,8 @@
             </w:tcMar>
           </w:tcPr>
           <w:p>
-            <w:pPr>
-              <w:spacing w:after="60" w:before="60" w:line="240" w:lineRule="auto"/>
-              <w:rPr/>
-            </w:pPr>
             <w:r>
-              <w:rPr>
-                <w:rFonts w:ascii="Calibri" w:cs="Calibri" w:eastAsia="Calibri" w:hAnsi="Calibri"/>
-                <w:b w:val="0"/>
-                <w:bCs w:val="0"/>
-                <w:i w:val="0"/>
-                <w:iCs w:val="0"/>
-                <w:color w:val="1a1a2e"/>
-                <w:sz w:val="22"/>
-                <w:szCs w:val="22"/>
-                <w:rtl w:val="0"/>
-              </w:rPr>
-              <w:t xml:space="preserve">Baja</w:t>
-            </w:r>
-            <w:r>
-              <w:rPr>
-                <w:rtl w:val="0"/>
-              </w:rPr>
+              <w:t>Baja</w:t>
             </w:r>
           </w:p>
         </w:tc>
@@ -21046,28 +20382,8 @@
             </w:tcMar>
           </w:tcPr>
           <w:p>
-            <w:pPr>
-              <w:spacing w:after="60" w:before="60" w:line="240" w:lineRule="auto"/>
-              <w:rPr/>
-            </w:pPr>
             <w:r>
-              <w:rPr>
-                <w:rFonts w:ascii="Calibri" w:cs="Calibri" w:eastAsia="Calibri" w:hAnsi="Calibri"/>
-                <w:b w:val="0"/>
-                <w:bCs w:val="0"/>
-                <w:i w:val="0"/>
-                <w:iCs w:val="0"/>
-                <w:color w:val="1a1a2e"/>
-                <w:sz w:val="22"/>
-                <w:szCs w:val="22"/>
-                <w:rtl w:val="0"/>
-              </w:rPr>
-              <w:t xml:space="preserve">Marketplaces de materiales</w:t>
-            </w:r>
-            <w:r>
-              <w:rPr>
-                <w:rtl w:val="0"/>
-              </w:rPr>
+              <w:t>Planner 5D / Floorplanner / Homestyler</w:t>
             </w:r>
           </w:p>
         </w:tc>
@@ -21082,28 +20398,8 @@
             </w:tcMar>
           </w:tcPr>
           <w:p>
-            <w:pPr>
-              <w:spacing w:after="60" w:before="60" w:line="240" w:lineRule="auto"/>
-              <w:rPr/>
-            </w:pPr>
             <w:r>
-              <w:rPr>
-                <w:rFonts w:ascii="Calibri" w:cs="Calibri" w:eastAsia="Calibri" w:hAnsi="Calibri"/>
-                <w:b w:val="0"/>
-                <w:bCs w:val="0"/>
-                <w:i w:val="0"/>
-                <w:iCs w:val="0"/>
-                <w:color w:val="1a1a2e"/>
-                <w:sz w:val="22"/>
-                <w:szCs w:val="22"/>
-                <w:rtl w:val="0"/>
-              </w:rPr>
-              <w:t xml:space="preserve">Media</w:t>
-            </w:r>
-            <w:r>
-              <w:rPr>
-                <w:rtl w:val="0"/>
-              </w:rPr>
+              <w:t>Alta</w:t>
             </w:r>
           </w:p>
         </w:tc>
@@ -21118,28 +20414,8 @@
             </w:tcMar>
           </w:tcPr>
           <w:p>
-            <w:pPr>
-              <w:spacing w:after="60" w:before="60" w:line="240" w:lineRule="auto"/>
-              <w:rPr/>
-            </w:pPr>
             <w:r>
-              <w:rPr>
-                <w:rFonts w:ascii="Calibri" w:cs="Calibri" w:eastAsia="Calibri" w:hAnsi="Calibri"/>
-                <w:b w:val="0"/>
-                <w:bCs w:val="0"/>
-                <w:i w:val="0"/>
-                <w:iCs w:val="0"/>
-                <w:color w:val="1a1a2e"/>
-                <w:sz w:val="22"/>
-                <w:szCs w:val="22"/>
-                <w:rtl w:val="0"/>
-              </w:rPr>
-              <w:t xml:space="preserve">Baja</w:t>
-            </w:r>
-            <w:r>
-              <w:rPr>
-                <w:rtl w:val="0"/>
-              </w:rPr>
+              <w:t>Media</w:t>
             </w:r>
           </w:p>
         </w:tc>
@@ -21154,28 +20430,8 @@
             </w:tcMar>
           </w:tcPr>
           <w:p>
-            <w:pPr>
-              <w:spacing w:after="60" w:before="60" w:line="240" w:lineRule="auto"/>
-              <w:rPr/>
-            </w:pPr>
             <w:r>
-              <w:rPr>
-                <w:rFonts w:ascii="Calibri" w:cs="Calibri" w:eastAsia="Calibri" w:hAnsi="Calibri"/>
-                <w:b w:val="0"/>
-                <w:bCs w:val="0"/>
-                <w:i w:val="0"/>
-                <w:iCs w:val="0"/>
-                <w:color w:val="1a1a2e"/>
-                <w:sz w:val="22"/>
-                <w:szCs w:val="22"/>
-                <w:rtl w:val="0"/>
-              </w:rPr>
-              <w:t xml:space="preserve">Media</w:t>
-            </w:r>
-            <w:r>
-              <w:rPr>
-                <w:rtl w:val="0"/>
-              </w:rPr>
+              <w:t>Baja</w:t>
             </w:r>
           </w:p>
         </w:tc>
@@ -21190,28 +20446,112 @@
             </w:tcMar>
           </w:tcPr>
           <w:p>
-            <w:pPr>
-              <w:spacing w:after="60" w:before="60" w:line="240" w:lineRule="auto"/>
-              <w:rPr/>
-            </w:pPr>
             <w:r>
-              <w:rPr>
-                <w:rFonts w:ascii="Calibri" w:cs="Calibri" w:eastAsia="Calibri" w:hAnsi="Calibri"/>
-                <w:b w:val="0"/>
-                <w:bCs w:val="0"/>
-                <w:i w:val="0"/>
-                <w:iCs w:val="0"/>
-                <w:color w:val="1a1a2e"/>
-                <w:sz w:val="22"/>
-                <w:szCs w:val="22"/>
-                <w:rtl w:val="0"/>
-              </w:rPr>
-              <w:t xml:space="preserve">Media</w:t>
+              <w:t>Baja</w:t>
             </w:r>
+          </w:p>
+        </w:tc>
+      </w:tr>
+      <w:tr>
+        <w:tc>
+          <w:tcPr>
+            <w:tcW w:type="dxa" w:w="1872"/>
+          </w:tcPr>
+          <w:p>
             <w:r>
-              <w:rPr>
-                <w:rtl w:val="0"/>
-              </w:rPr>
+              <w:t>Revit / SketchUp / software profesional</w:t>
+            </w:r>
+          </w:p>
+        </w:tc>
+        <w:tc>
+          <w:tcPr>
+            <w:tcW w:type="dxa" w:w="1872"/>
+          </w:tcPr>
+          <w:p>
+            <w:r>
+              <w:t>Baja</w:t>
+            </w:r>
+          </w:p>
+        </w:tc>
+        <w:tc>
+          <w:tcPr>
+            <w:tcW w:type="dxa" w:w="1872"/>
+          </w:tcPr>
+          <w:p>
+            <w:r>
+              <w:t>Alta</w:t>
+            </w:r>
+          </w:p>
+        </w:tc>
+        <w:tc>
+          <w:tcPr>
+            <w:tcW w:type="dxa" w:w="1872"/>
+          </w:tcPr>
+          <w:p>
+            <w:r>
+              <w:t>Alta</w:t>
+            </w:r>
+          </w:p>
+        </w:tc>
+        <w:tc>
+          <w:tcPr>
+            <w:tcW w:type="dxa" w:w="1872"/>
+          </w:tcPr>
+          <w:p>
+            <w:r>
+              <w:t>Baja</w:t>
+            </w:r>
+          </w:p>
+        </w:tc>
+      </w:tr>
+      <w:tr>
+        <w:tc>
+          <w:tcPr>
+            <w:tcW w:type="dxa" w:w="1872"/>
+          </w:tcPr>
+          <w:p>
+            <w:r>
+              <w:t>Estudios tradicionales</w:t>
+            </w:r>
+          </w:p>
+        </w:tc>
+        <w:tc>
+          <w:tcPr>
+            <w:tcW w:type="dxa" w:w="1872"/>
+          </w:tcPr>
+          <w:p>
+            <w:r>
+              <w:t>Baja</w:t>
+            </w:r>
+          </w:p>
+        </w:tc>
+        <w:tc>
+          <w:tcPr>
+            <w:tcW w:type="dxa" w:w="1872"/>
+          </w:tcPr>
+          <w:p>
+            <w:r>
+              <w:t>Alta</w:t>
+            </w:r>
+          </w:p>
+        </w:tc>
+        <w:tc>
+          <w:tcPr>
+            <w:tcW w:type="dxa" w:w="1872"/>
+          </w:tcPr>
+          <w:p>
+            <w:r>
+              <w:t>Media-alta</w:t>
+            </w:r>
+          </w:p>
+        </w:tc>
+        <w:tc>
+          <w:tcPr>
+            <w:tcW w:type="dxa" w:w="1872"/>
+          </w:tcPr>
+          <w:p>
+            <w:r>
+              <w:t>Baja</w:t>
             </w:r>
           </w:p>
         </w:tc>
@@ -21234,135 +20574,7 @@
         <w:rPr/>
       </w:pPr>
       <w:r>
-        <w:rPr>
-          <w:rFonts w:ascii="Calibri" w:cs="Calibri" w:eastAsia="Calibri" w:hAnsi="Calibri"/>
-          <w:b w:val="0"/>
-          <w:bCs w:val="0"/>
-          <w:i w:val="0"/>
-          <w:iCs w:val="0"/>
-          <w:color w:val="1a1a2e"/>
-          <w:sz w:val="26"/>
-          <w:szCs w:val="26"/>
-          <w:rtl w:val="0"/>
-        </w:rPr>
-        <w:t xml:space="preserve">La lectura del mapa muestra una posición diferencial clara. </w:t>
-      </w:r>
-      <w:r>
-        <w:rPr>
-          <w:rFonts w:ascii="Calibri" w:cs="Calibri" w:eastAsia="Calibri" w:hAnsi="Calibri"/>
-          <w:b w:val="1"/>
-          <w:bCs w:val="1"/>
-          <w:i w:val="0"/>
-          <w:iCs w:val="0"/>
-          <w:color w:val="1a1a2e"/>
-          <w:sz w:val="26"/>
-          <w:szCs w:val="26"/>
-          <w:rtl w:val="0"/>
-        </w:rPr>
-        <w:t xml:space="preserve">Los estudios tradicionales</w:t>
-      </w:r>
-      <w:r>
-        <w:rPr>
-          <w:rFonts w:ascii="Calibri" w:cs="Calibri" w:eastAsia="Calibri" w:hAnsi="Calibri"/>
-          <w:b w:val="0"/>
-          <w:bCs w:val="0"/>
-          <w:i w:val="0"/>
-          <w:iCs w:val="0"/>
-          <w:color w:val="1a1a2e"/>
-          <w:sz w:val="26"/>
-          <w:szCs w:val="26"/>
-          <w:rtl w:val="0"/>
-        </w:rPr>
-        <w:t xml:space="preserve"> concentran profundidad técnica y personalización, pero con una barrera de entrada más alta. </w:t>
-      </w:r>
-      <w:r>
-        <w:rPr>
-          <w:rFonts w:ascii="Calibri" w:cs="Calibri" w:eastAsia="Calibri" w:hAnsi="Calibri"/>
-          <w:b w:val="1"/>
-          <w:bCs w:val="1"/>
-          <w:i w:val="0"/>
-          <w:iCs w:val="0"/>
-          <w:color w:val="1a1a2e"/>
-          <w:sz w:val="26"/>
-          <w:szCs w:val="26"/>
-          <w:rtl w:val="0"/>
-        </w:rPr>
-        <w:t xml:space="preserve">Las apps de renders</w:t>
-      </w:r>
-      <w:r>
-        <w:rPr>
-          <w:rFonts w:ascii="Calibri" w:cs="Calibri" w:eastAsia="Calibri" w:hAnsi="Calibri"/>
-          <w:b w:val="0"/>
-          <w:bCs w:val="0"/>
-          <w:i w:val="0"/>
-          <w:iCs w:val="0"/>
-          <w:color w:val="1a1a2e"/>
-          <w:sz w:val="26"/>
-          <w:szCs w:val="26"/>
-          <w:rtl w:val="0"/>
-        </w:rPr>
-        <w:t xml:space="preserve"> ofrecen acceso rápido y atractivo visual, aunque con poco criterio económico y sin una lógica de circularidad. </w:t>
-      </w:r>
-      <w:r>
-        <w:rPr>
-          <w:rFonts w:ascii="Calibri" w:cs="Calibri" w:eastAsia="Calibri" w:hAnsi="Calibri"/>
-          <w:b w:val="1"/>
-          <w:bCs w:val="1"/>
-          <w:i w:val="0"/>
-          <w:iCs w:val="0"/>
-          <w:color w:val="1a1a2e"/>
-          <w:sz w:val="26"/>
-          <w:szCs w:val="26"/>
-          <w:rtl w:val="0"/>
-        </w:rPr>
-        <w:t xml:space="preserve">Los marketplaces</w:t>
-      </w:r>
-      <w:r>
-        <w:rPr>
-          <w:rFonts w:ascii="Calibri" w:cs="Calibri" w:eastAsia="Calibri" w:hAnsi="Calibri"/>
-          <w:b w:val="0"/>
-          <w:bCs w:val="0"/>
-          <w:i w:val="0"/>
-          <w:iCs w:val="0"/>
-          <w:color w:val="1a1a2e"/>
-          <w:sz w:val="26"/>
-          <w:szCs w:val="26"/>
-          <w:rtl w:val="0"/>
-        </w:rPr>
-        <w:t xml:space="preserve"> resuelven parte de la transacción, pero sin suficiente personalización ni conexión directa con el proyecto habitacional. </w:t>
-      </w:r>
-      <w:r>
-        <w:rPr>
-          <w:rFonts w:ascii="Calibri" w:cs="Calibri" w:eastAsia="Calibri" w:hAnsi="Calibri"/>
-          <w:b w:val="1"/>
-          <w:bCs w:val="1"/>
-          <w:i w:val="0"/>
-          <w:iCs w:val="0"/>
-          <w:color w:val="1a1a2e"/>
-          <w:sz w:val="26"/>
-          <w:szCs w:val="26"/>
-          <w:rtl w:val="0"/>
-        </w:rPr>
-        <w:t xml:space="preserve">HabitatIA</w:t>
-      </w:r>
-      <w:r>
-        <w:rPr>
-          <w:rFonts w:ascii="Calibri" w:cs="Calibri" w:eastAsia="Calibri" w:hAnsi="Calibri"/>
-          <w:b w:val="0"/>
-          <w:bCs w:val="0"/>
-          <w:i w:val="0"/>
-          <w:iCs w:val="0"/>
-          <w:color w:val="1a1a2e"/>
-          <w:sz w:val="26"/>
-          <w:szCs w:val="26"/>
-          <w:rtl w:val="0"/>
-        </w:rPr>
-        <w:t xml:space="preserve"> ocupa el cruce entre accesibilidad, personalización, lectura económica y reutilización de materiales dentro de una misma experiencia.</w:t>
-      </w:r>
-      <w:r>
-        <w:rPr>
-          <w:rtl w:val="0"/>
-        </w:rPr>
+        <w:t>La lectura del mapa muestra una posición diferencial más concreta. Mercado Libre y otros marketplaces resuelven escala transaccional, pero sin traducir la demanda desde un proyecto habitacional. Easy y otros corralones digitales aportan confianza comercial y catálogo formal, aunque no acompañan la etapa de definición del proyecto. Planner 5D, Floorplanner y Homestyler facilitan visualización y exploración, pero no conectan de forma nativa esa experiencia con presupuesto preliminar ni con compra contextualizada de materiales. Revit, SketchUp y herramientas profesionales ofrecen profundidad técnica, aunque con mayor barrera de entrada. HabitatIA intenta ocupar el cruce entre accesibilidad, personalización, lectura económica, materiales y reutilización dentro de una misma experiencia.</w:t>
       </w:r>
     </w:p>
     <w:p>
@@ -21443,23 +20655,7 @@
         <w:rPr/>
       </w:pPr>
       <w:r>
-        <w:rPr>
-          <w:rFonts w:ascii="Calibri" w:cs="Calibri" w:eastAsia="Calibri" w:hAnsi="Calibri"/>
-          <w:b w:val="0"/>
-          <w:bCs w:val="0"/>
-          <w:i w:val="0"/>
-          <w:iCs w:val="0"/>
-          <w:color w:val="1a1a2e"/>
-          <w:sz w:val="26"/>
-          <w:szCs w:val="26"/>
-          <w:rtl w:val="0"/>
-        </w:rPr>
-        <w:t xml:space="preserve">Este es probablemente su diferencial más fuerte. La propuesta integra visualización, plano, materiales, presupuesto y ahorro potencial en un mismo recorrido.</w:t>
-      </w:r>
-      <w:r>
-        <w:rPr>
-          <w:rtl w:val="0"/>
-        </w:rPr>
+        <w:t>Este es probablemente su diferencial más fuerte. La propuesta integra visualización, plano, materiales, presupuesto y ahorro potencial en un mismo recorrido, mientras que los competidores reales suelen resolver solo una parte: o la compra, o la visualización, o la documentación profesional.</w:t>
       </w:r>
     </w:p>
     <w:p>

</xml_diff>

<commit_message>
docs: specify HabitatIA acquisition funnel and metrics
</commit_message>
<xml_diff>
--- a/Entregable N1 HabitatIA.docx
+++ b/Entregable N1 HabitatIA.docx
@@ -23674,7 +23674,7 @@
           <w:szCs w:val="26"/>
           <w:rtl w:val="0"/>
         </w:rPr>
-        <w:t xml:space="preserve">En una etapa inicial, campañas segmentadas pueden resultar útiles para validar mensajes y acelerar aprendizaje. La pauta no debería orientarse solo a tráfico, sino a señales concretas de interés: formularios completados, demos solicitadas, pruebas del flujo o publicaciones de materiales.</w:t>
+        <w:t>En una etapa inicial, las campañas de performance deberían concentrarse en pocos canales y con roles bien definidos. Meta Ads puede servir para captar demanda latente mediante creatividades que muestren claridad de costos, visualización y ahorro potencial. Google Search, en cambio, debería atacar intención alta en búsquedas como costo de construir, cálculo preliminar de materiales, casa en terreno propio o presupuesto de obra. A eso conviene sumar una tercera vía de adquisición menos escalable pero más calificada: alianzas con corralones, arquitectos, estudios y pequeños constructores que puedan derivar usuarios con necesidad real. La pauta no debería optimizarse por tráfico bruto, sino por señales concretas de avance: leads calificados, inicios de flujo, formularios completos, demos pedidas o publicaciones efectivas en marketplace.</w:t>
       </w:r>
       <w:r>
         <w:rPr>
@@ -24211,7 +24211,7 @@
           <w:szCs w:val="26"/>
           <w:rtl w:val="0"/>
         </w:rPr>
-        <w:t xml:space="preserve">Pueden actuar como aliados comerciales, fuentes de legitimidad y eventualmente nodos de derivación de usuarios.</w:t>
+        <w:t>Pueden actuar como aliados comerciales, fuentes de legitimidad y nodos de derivación de usuarios. La lógica más razonable no sería pedirles una venta compleja, sino ofrecerles una herramienta útil para clientes que todavía no tienen claro qué construir, cuánto material van a necesitar o cómo ordenar un presupuesto preliminar. En términos operativos, podrían funcionar mediante acuerdos simples de derivación, piezas físicas en punto de venta, QR a landing pages específicas o beneficios compartidos una vez que el usuario avance dentro del flujo.</w:t>
       </w:r>
       <w:r>
         <w:rPr>
@@ -24262,7 +24262,7 @@
           <w:szCs w:val="26"/>
           <w:rtl w:val="0"/>
         </w:rPr>
-        <w:t xml:space="preserve">Además de alimentar el marketplace, pueden convertirse en validadores, aliados estratégicos o incluso beneficiarios de ciertos servicios premium futuros.</w:t>
+        <w:t>Además de alimentar el marketplace, pueden convertirse en validadores y aliados estratégicos del canal comercial. Del lado de adquisición, su mayor valor está en referir usuarios con terreno propio o decisión de obra ya iniciada, es decir, perfiles con más probabilidad de conversión que el tráfico frío. Del lado de monetización, también pueden abrir la puerta a servicios premium o a publicaciones mejor curadas dentro del marketplace.</w:t>
       </w:r>
       <w:r>
         <w:rPr>
@@ -24313,7 +24313,7 @@
           <w:szCs w:val="26"/>
           <w:rtl w:val="0"/>
         </w:rPr>
-        <w:t xml:space="preserve">Este tipo de espacios puede servir para mostrar la propuesta, captar señales tempranas y construir reputación dentro del ecosistema.</w:t>
+        <w:t>Este tipo de espacios puede servir para mostrar la propuesta, captar señales tempranas y construir reputación dentro del ecosistema. No deberían leerse como canal masivo, sino como instancia de legitimación y adquisición cualificada: menos volumen, pero conversaciones de mayor calidad con profesionales, proveedores y potenciales usuarios en etapa más avanzada.</w:t>
       </w:r>
       <w:r>
         <w:rPr>
@@ -24441,7 +24441,7 @@
           <w:szCs w:val="26"/>
           <w:rtl w:val="0"/>
         </w:rPr>
-        <w:t xml:space="preserve">Captar usuarios mediante contenido, pauta, SEO, alianzas y presencia en espacios relevantes.</w:t>
+        <w:t>La etapa de Awareness debería combinar canales de intención y canales de descubrimiento. Una hipótesis inicial razonable sería trabajar con un mix donde Meta Ads y contenidos pagos expliquen el problema y generen curiosidad, Google capture búsquedas de alta intención, y las alianzas con corralones y arquitectos aporten tráfico más calificado. Como referencia operativa mensual para una primera etapa, HabitatIA podría proponerse atraer entre 5.000 y 7.000 visitas calificadas al sitio o a landing pages específicas, evitando medir éxito solo por impresiones o alcance.</w:t>
       </w:r>
       <w:r>
         <w:rPr>
@@ -24492,7 +24492,7 @@
           <w:szCs w:val="26"/>
           <w:rtl w:val="0"/>
         </w:rPr>
-        <w:t xml:space="preserve">Lograr que el usuario pruebe la propuesta o deje sus datos para iniciar el recorrido.</w:t>
+        <w:t>La etapa de Consideración debería medir si ese tráfico realmente reconoce valor. Un supuesto prudente sería esperar que entre 10 % y 14 % de esas visitas dejen sus datos o inicien el flujo principal. Sobre una base de 6.000 visitas calificadas mensuales, eso implicaría entre 600 y 840 usuarios que pasan de awareness a consideración real. En esta fase, los activos más importantes no son solo la landing, sino también WhatsApp, email de seguimiento y demos breves para quienes necesiten mayor legitimación.</w:t>
       </w:r>
       <w:r>
         <w:rPr>
@@ -24543,7 +24543,7 @@
           <w:szCs w:val="26"/>
           <w:rtl w:val="0"/>
         </w:rPr>
-        <w:t xml:space="preserve">Entregar una experiencia suficientemente valiosa como para que el usuario perciba utilidad real en el producto.</w:t>
+        <w:t>La etapa de Conversión no debería leerse como un único paso, sino como una secuencia. Primero, que el usuario complete la experiencia principal y perciba utilidad concreta. Segundo, que una parte de esos usuarios avance hacia monetización premium. Si se toma como supuesto que entre 35 % y 45 % de los usuarios que iniciaron el flujo lo completan con una experiencia satisfactoria, eso dejaría entre 210 y 378 activados mensuales sobre el escenario anterior. Si luego entre 8 % y 12 % de esos activados compran el plan premium, HabitatIA podría aspirar en una etapa temprana a entre 17 y 45 conversiones pagas mensuales, con una base de trabajo razonable en torno a 25 o 30.</w:t>
       </w:r>
       <w:r>
         <w:rPr>
@@ -24594,7 +24594,7 @@
           <w:szCs w:val="26"/>
           <w:rtl w:val="0"/>
         </w:rPr>
-        <w:t>La monetización debería explicitarse desde el inicio con una lógica simple: entrada gratuita o de muy bajo costo para facilitar prueba, plan premium para quienes quieran descargar cómputo detallado en Excel, reporte ampliado y variantes comparativas básicas, y comisión del 8 % sobre operaciones exitosas del marketplace una vez exista suficiente tracción. A eso podrían sumarse más adelante publicaciones destacadas o servicios complementarios según el segmento.</w:t>
+        <w:t>La monetización debería explicitarse desde el inicio con una lógica simple: entrada gratuita o de muy bajo costo para facilitar prueba, plan premium para quienes quieran descargar cómputo detallado en Excel, reporte ampliado y variantes comparativas básicas, y comisión del 8 % sobre operaciones exitosas del marketplace una vez exista suficiente tracción. En términos de economics, si el ticket inicial del premium se ubica alrededor de ARS 29.900 y el objetivo de adquisición paga se trabaja con un CAC blended deseable por debajo de ARS 12.000 a ARS 15.000 por cliente premium, la relación entre captación y monetización empieza a ser defendible. Si además una parte de esos usuarios repite, recomienda o más adelante opera dentro del marketplace, el LTV podría ubicarse razonablemente por encima del ingreso de una sola compra inicial.</w:t>
       </w:r>
       <w:r>
         <w:rPr>
@@ -24645,7 +24645,7 @@
           <w:szCs w:val="26"/>
           <w:rtl w:val="0"/>
         </w:rPr>
-        <w:t xml:space="preserve">Buscar que la experiencia genere satisfacción, confianza y disposición a recomendar o a reutilizar la plataforma.</w:t>
+        <w:t>Buscar que la experiencia genere satisfacción, confianza y disposición a recomendar o a reutilizar la plataforma. En una primera etapa, una referencia sana podría ser aspirar a que al menos 15 % a 20 % de los usuarios activados regresen, compartan la propuesta o continúen la conversación por otro canal. Esa retención temprana vale tanto como la conversión porque ayuda a bajar CAC efectivo y mejora la calidad del aprendizaje comercial.</w:t>
       </w:r>
       <w:r>
         <w:rPr>
@@ -25007,7 +25007,7 @@
           <w:szCs w:val="26"/>
           <w:rtl w:val="0"/>
         </w:rPr>
-        <w:t xml:space="preserve">Una estrategia inicial realista debería concentrarse en:</w:t>
+        <w:t>Una estrategia inicial realista debería concentrarse en pocos canales, medición estricta y aprendizaje rápido. En concreto: Meta Ads para validar ángulos creativos, Google para capturar demanda de alta intención, alianzas con corralones y arquitectos para derivación cualificada, demostraciones de valor concretas dentro del flujo, y activación de una oferta inicial de materiales suficientemente confiable para que la promesa de ahorro no quede vacía.</w:t>
       </w:r>
       <w:r>
         <w:rPr>
@@ -25471,7 +25471,7 @@
           <w:szCs w:val="26"/>
           <w:rtl w:val="0"/>
         </w:rPr>
-        <w:t xml:space="preserve">La meta no debería ser escalar rápido, sino atraer usuarios con intención real y aprender de su comportamiento. Esta etapa puede priorizar campañas acotadas, contenido educativo y demos guiadas.</w:t>
+        <w:t>La meta no debería ser escalar rápido, sino atraer usuarios con intención real y aprender de su comportamiento. Esta etapa puede priorizar campañas acotadas en Meta y Google, contenido educativo y demos guiadas, con foco en construir una primera línea base de métricas: volumen de visitas calificadas, porcentaje de inicio de flujo, tasa de activación, CAC por lead relevante y CAC por cliente premium.</w:t>
       </w:r>
       <w:r>
         <w:rPr>
@@ -25928,7 +25928,7 @@
           <w:szCs w:val="26"/>
           <w:rtl w:val="0"/>
         </w:rPr>
-        <w:t xml:space="preserve">Para gestionar el plan comercial con criterio, podrían definirse indicadores iniciales tales como tasa de inicio y finalización del formulario, porcentaje de usuarios que visualizan el presupuesto completo, tasa de usuarios que consultan el ahorro potencial, cantidad de materiales publicados por oferente, porcentaje de publicaciones con consulta o interés, costo de adquisición por lead relevante y tasa de activación de usuarios que completan la experiencia principal.</w:t>
+        <w:t>Para gestionar el plan comercial con criterio, conviene definir un set corto de métricas vinculadas directamente al funnel. En awareness: visitas calificadas por canal, CTR de anuncios y costo por visita relevante. En consideración: tasa de inicio de flujo o captura de lead, costo por lead calificado y tasa de respuesta por WhatsApp o email. En conversión: tasa de finalización del flujo, porcentaje de usuarios que visualizan presupuesto completo, porcentaje que consulta ahorro potencial y conversion rate a premium. En economics: CAC blended por cliente premium, ticket promedio inicial, payback simple y una referencia preliminar de LTV. Si se toma el plan premium con punto de entrada en ARS 29.900 y se asume una recurrencia o extensión promedio del vínculo equivalente a 1,3 compras o eventos de valor por usuario monetizado, el LTV inicial orientativo podría ubicarse cerca de ARS 38.870 antes de considerar ingresos adicionales del marketplace. Esta métrica no debe leerse como certeza, sino como hipótesis operativa para evaluar si el CAC está en niveles sostenibles.</w:t>
       </w:r>
       <w:r>
         <w:rPr>

</xml_diff>